<commit_message>
Respaldo temporal antes de realizar el merge con la rama brillaldo
</commit_message>
<xml_diff>
--- a/3. Pentesting/3.1 Metodología.docx
+++ b/3. Pentesting/3.1 Metodología.docx
@@ -220,9 +220,9 @@
               <mc:AlternateContent>
                 <mc:Choice Requires="wps">
                   <w:drawing>
-                    <wp:inline distT="0" distB="0" distL="0" distR="0" wp14:anchorId="2E81C4ED" wp14:editId="7BD213EF">
-                      <wp:extent cx="3528695" cy="666750"/>
-                      <wp:effectExtent l="0" t="0" r="0" b="0"/>
+                    <wp:inline distT="0" distB="0" distL="0" distR="0" wp14:anchorId="2E81C4ED" wp14:editId="5EA30A96">
+                      <wp:extent cx="3528695" cy="1249680"/>
+                      <wp:effectExtent l="0" t="0" r="0" b="7620"/>
                       <wp:docPr id="8" name="Cuadro de texto 8"/>
                       <wp:cNvGraphicFramePr/>
                       <a:graphic xmlns:a="http://schemas.openxmlformats.org/drawingml/2006/main">
@@ -232,7 +232,7 @@
                             <wps:spPr>
                               <a:xfrm>
                                 <a:off x="0" y="0"/>
-                                <a:ext cx="3528695" cy="666750"/>
+                                <a:ext cx="3528695" cy="1249680"/>
                               </a:xfrm>
                               <a:prstGeom prst="rect">
                                 <a:avLst/>
@@ -257,7 +257,7 @@
                                       <w:rFonts w:ascii="Calibri" w:hAnsi="Calibri" w:cs="Calibri"/>
                                       <w:lang w:val="es-MX"/>
                                     </w:rPr>
-                                    <w:t>2.3 Remediación</w:t>
+                                    <w:t>3.1 METODOLOGÍA</w:t>
                                   </w:r>
                                 </w:p>
                               </w:txbxContent>
@@ -280,7 +280,7 @@
                       <v:stroke joinstyle="miter"/>
                       <v:path gradientshapeok="t" o:connecttype="rect"/>
                     </v:shapetype>
-                    <v:shape id="Cuadro de texto 8" o:spid="_x0000_s1027" type="#_x0000_t202" style="width:277.85pt;height:52.5pt;visibility:visible;mso-wrap-style:square;mso-left-percent:-10001;mso-top-percent:-10001;mso-position-horizontal:absolute;mso-position-horizontal-relative:char;mso-position-vertical:absolute;mso-position-vertical-relative:line;mso-left-percent:-10001;mso-top-percent:-10001;v-text-anchor:top" o:gfxdata="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" filled="f" stroked="f" strokeweight=".5pt">
+                    <v:shape id="Cuadro de texto 8" o:spid="_x0000_s1027" type="#_x0000_t202" style="width:277.85pt;height:98.4pt;visibility:visible;mso-wrap-style:square;mso-left-percent:-10001;mso-top-percent:-10001;mso-position-horizontal:absolute;mso-position-horizontal-relative:char;mso-position-vertical:absolute;mso-position-vertical-relative:line;mso-left-percent:-10001;mso-top-percent:-10001;v-text-anchor:top" o:gfxdata="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" filled="f" stroked="f" strokeweight=".5pt">
                       <v:textbox>
                         <w:txbxContent>
                           <w:p>
@@ -296,7 +296,7 @@
                                 <w:rFonts w:ascii="Calibri" w:hAnsi="Calibri" w:cs="Calibri"/>
                                 <w:lang w:val="es-MX"/>
                               </w:rPr>
-                              <w:t>2.3 Remediación</w:t>
+                              <w:t>3.1 METODOLOGÍA</w:t>
                             </w:r>
                           </w:p>
                         </w:txbxContent>
@@ -688,7 +688,7 @@
           <w:lang w:bidi="es-ES"/>
         </w:rPr>
         <w:lastRenderedPageBreak/>
-        <w:t>REMEDIACIÓN</w:t>
+        <w:t>METODOLOGÍA</w:t>
       </w:r>
     </w:p>
     <w:p>
@@ -731,7 +731,7 @@
         <w:rPr>
           <w:noProof/>
         </w:rPr>
-        <w:t>Este plan de remediación describe las acciones técnicas necesarias para mitigar los riesgos identificados en el reporte de hallazgos SEC-FIND-2026-003. La implementación de estas medidas es obligatoria para garantizar la integridad y confidencialidad de la plataforma Electronics-eCommerce.</w:t>
+        <w:t>Este documento define el marco metodológico utilizado para evaluar la seguridad de la plataforma "Electronics-eCommerce" mediante pruebas de intrusión controladas. El enfoque adoptado permite identificar vulnerabilidades que podrían ser explotadas por atacantes reales, simulando sus tácticas, técnicas y procedimientos (TTPs).</w:t>
       </w:r>
     </w:p>
     <w:p>
@@ -745,716 +745,23 @@
       </w:pPr>
     </w:p>
     <w:p>
-      <w:r>
-        <w:t>CRONOGRAMA DE IMPLEMENTACIÓN PRIORIZADA</w:t>
-      </w:r>
-    </w:p>
-    <w:p/>
-    <w:tbl>
-      <w:tblPr>
-        <w:tblStyle w:val="Tablaconcuadrcula"/>
-        <w:tblW w:w="9976" w:type="dxa"/>
-        <w:tblLook w:val="04A0" w:firstRow="1" w:lastRow="0" w:firstColumn="1" w:lastColumn="0" w:noHBand="0" w:noVBand="1"/>
-      </w:tblPr>
-      <w:tblGrid>
-        <w:gridCol w:w="1735"/>
-        <w:gridCol w:w="1284"/>
-        <w:gridCol w:w="4720"/>
-        <w:gridCol w:w="2237"/>
-      </w:tblGrid>
-      <w:tr>
-        <w:trPr>
-          <w:trHeight w:val="587"/>
-        </w:trPr>
-        <w:tc>
-          <w:tcPr>
-            <w:tcW w:w="1735" w:type="dxa"/>
-            <w:shd w:val="clear" w:color="auto" w:fill="024F75" w:themeFill="accent1"/>
-          </w:tcPr>
-          <w:p>
-            <w:pPr>
-              <w:jc w:val="center"/>
-              <w:rPr>
-                <w:noProof/>
-                <w:color w:val="F6F6F6"/>
-              </w:rPr>
-            </w:pPr>
-            <w:r>
-              <w:rPr>
-                <w:noProof/>
-                <w:color w:val="F6F6F6"/>
-              </w:rPr>
-              <w:t>Prioridad</w:t>
-            </w:r>
-          </w:p>
-        </w:tc>
-        <w:tc>
-          <w:tcPr>
-            <w:tcW w:w="1284" w:type="dxa"/>
-            <w:shd w:val="clear" w:color="auto" w:fill="024F75" w:themeFill="accent1"/>
-          </w:tcPr>
-          <w:p>
-            <w:pPr>
-              <w:jc w:val="center"/>
-              <w:rPr>
-                <w:noProof/>
-                <w:color w:val="F6F6F6"/>
-              </w:rPr>
-            </w:pPr>
-            <w:r>
-              <w:rPr>
-                <w:noProof/>
-                <w:color w:val="F6F6F6"/>
-              </w:rPr>
-              <w:t>ID</w:t>
-            </w:r>
-          </w:p>
-        </w:tc>
-        <w:tc>
-          <w:tcPr>
-            <w:tcW w:w="4720" w:type="dxa"/>
-            <w:shd w:val="clear" w:color="auto" w:fill="024F75" w:themeFill="accent1"/>
-          </w:tcPr>
-          <w:p>
-            <w:pPr>
-              <w:jc w:val="center"/>
-              <w:rPr>
-                <w:noProof/>
-                <w:color w:val="F6F6F6"/>
-              </w:rPr>
-            </w:pPr>
-            <w:r>
-              <w:rPr>
-                <w:noProof/>
-                <w:color w:val="F6F6F6"/>
-              </w:rPr>
-              <w:t>Acción</w:t>
-            </w:r>
-          </w:p>
-        </w:tc>
-        <w:tc>
-          <w:tcPr>
-            <w:tcW w:w="2237" w:type="dxa"/>
-            <w:shd w:val="clear" w:color="auto" w:fill="024F75" w:themeFill="accent1"/>
-          </w:tcPr>
-          <w:p>
-            <w:pPr>
-              <w:jc w:val="center"/>
-              <w:rPr>
-                <w:noProof/>
-                <w:color w:val="F6F6F6"/>
-              </w:rPr>
-            </w:pPr>
-            <w:r>
-              <w:rPr>
-                <w:noProof/>
-                <w:color w:val="F6F6F6"/>
-              </w:rPr>
-              <w:t>Plazo estimado</w:t>
-            </w:r>
-          </w:p>
-        </w:tc>
-      </w:tr>
-      <w:tr>
-        <w:trPr>
-          <w:trHeight w:val="607"/>
-        </w:trPr>
-        <w:tc>
-          <w:tcPr>
-            <w:tcW w:w="1735" w:type="dxa"/>
-          </w:tcPr>
-          <w:p>
-            <w:pPr>
-              <w:pStyle w:val="Contenido"/>
-              <w:rPr>
-                <w:noProof/>
-              </w:rPr>
-            </w:pPr>
-            <w:r>
-              <w:rPr>
-                <w:noProof/>
-              </w:rPr>
-              <w:t>Inmediata</w:t>
-            </w:r>
-          </w:p>
-        </w:tc>
-        <w:tc>
-          <w:tcPr>
-            <w:tcW w:w="1284" w:type="dxa"/>
-          </w:tcPr>
-          <w:p>
-            <w:pPr>
-              <w:pStyle w:val="Contenido"/>
-              <w:jc w:val="center"/>
-              <w:rPr>
-                <w:noProof/>
-              </w:rPr>
-            </w:pPr>
-            <w:r>
-              <w:rPr>
-                <w:noProof/>
-              </w:rPr>
-              <w:t>H-001</w:t>
-            </w:r>
-          </w:p>
-        </w:tc>
-        <w:tc>
-          <w:tcPr>
-            <w:tcW w:w="4720" w:type="dxa"/>
-          </w:tcPr>
-          <w:p>
-            <w:pPr>
-              <w:pStyle w:val="Contenido"/>
-              <w:rPr>
-                <w:noProof/>
-              </w:rPr>
-            </w:pPr>
-            <w:r>
-              <w:rPr>
-                <w:noProof/>
-              </w:rPr>
-              <w:t>Actualización del Driver de BD</w:t>
-            </w:r>
-          </w:p>
-        </w:tc>
-        <w:tc>
-          <w:tcPr>
-            <w:tcW w:w="2237" w:type="dxa"/>
-          </w:tcPr>
-          <w:p>
-            <w:pPr>
-              <w:pStyle w:val="Contenido"/>
-              <w:jc w:val="center"/>
-              <w:rPr>
-                <w:noProof/>
-              </w:rPr>
-            </w:pPr>
-            <w:r>
-              <w:rPr>
-                <w:noProof/>
-              </w:rPr>
-              <w:t>24h</w:t>
-            </w:r>
-          </w:p>
-        </w:tc>
-      </w:tr>
-      <w:tr>
-        <w:trPr>
-          <w:trHeight w:val="587"/>
-        </w:trPr>
-        <w:tc>
-          <w:tcPr>
-            <w:tcW w:w="1735" w:type="dxa"/>
-          </w:tcPr>
-          <w:p>
-            <w:pPr>
-              <w:pStyle w:val="Contenido"/>
-              <w:rPr>
-                <w:noProof/>
-              </w:rPr>
-            </w:pPr>
-            <w:r>
-              <w:rPr>
-                <w:noProof/>
-              </w:rPr>
-              <w:t>Inmediata</w:t>
-            </w:r>
-          </w:p>
-        </w:tc>
-        <w:tc>
-          <w:tcPr>
-            <w:tcW w:w="1284" w:type="dxa"/>
-          </w:tcPr>
-          <w:p>
-            <w:pPr>
-              <w:pStyle w:val="Contenido"/>
-              <w:jc w:val="center"/>
-              <w:rPr>
-                <w:noProof/>
-              </w:rPr>
-            </w:pPr>
-            <w:r>
-              <w:rPr>
-                <w:noProof/>
-              </w:rPr>
-              <w:t>H-002</w:t>
-            </w:r>
-          </w:p>
-        </w:tc>
-        <w:tc>
-          <w:tcPr>
-            <w:tcW w:w="4720" w:type="dxa"/>
-          </w:tcPr>
-          <w:p>
-            <w:pPr>
-              <w:pStyle w:val="Contenido"/>
-              <w:rPr>
-                <w:noProof/>
-              </w:rPr>
-            </w:pPr>
-            <w:r>
-              <w:rPr>
-                <w:noProof/>
-              </w:rPr>
-              <w:t>Implementación de Middlewares</w:t>
-            </w:r>
-          </w:p>
-        </w:tc>
-        <w:tc>
-          <w:tcPr>
-            <w:tcW w:w="2237" w:type="dxa"/>
-          </w:tcPr>
-          <w:p>
-            <w:pPr>
-              <w:pStyle w:val="Contenido"/>
-              <w:jc w:val="center"/>
-              <w:rPr>
-                <w:noProof/>
-              </w:rPr>
-            </w:pPr>
-            <w:r>
-              <w:rPr>
-                <w:noProof/>
-              </w:rPr>
-              <w:t>48h</w:t>
-            </w:r>
-          </w:p>
-        </w:tc>
-      </w:tr>
-      <w:tr>
-        <w:trPr>
-          <w:trHeight w:val="587"/>
-        </w:trPr>
-        <w:tc>
-          <w:tcPr>
-            <w:tcW w:w="1735" w:type="dxa"/>
-          </w:tcPr>
-          <w:p>
-            <w:pPr>
-              <w:pStyle w:val="Contenido"/>
-              <w:rPr>
-                <w:noProof/>
-              </w:rPr>
-            </w:pPr>
-            <w:r>
-              <w:rPr>
-                <w:noProof/>
-              </w:rPr>
-              <w:t>Alta</w:t>
-            </w:r>
-          </w:p>
-        </w:tc>
-        <w:tc>
-          <w:tcPr>
-            <w:tcW w:w="1284" w:type="dxa"/>
-          </w:tcPr>
-          <w:p>
-            <w:pPr>
-              <w:pStyle w:val="Contenido"/>
-              <w:jc w:val="center"/>
-              <w:rPr>
-                <w:noProof/>
-              </w:rPr>
-            </w:pPr>
-            <w:r>
-              <w:rPr>
-                <w:noProof/>
-              </w:rPr>
-              <w:t>H-003</w:t>
-            </w:r>
-          </w:p>
-        </w:tc>
-        <w:tc>
-          <w:tcPr>
-            <w:tcW w:w="4720" w:type="dxa"/>
-          </w:tcPr>
-          <w:p>
-            <w:pPr>
-              <w:pStyle w:val="Contenido"/>
-              <w:rPr>
-                <w:noProof/>
-              </w:rPr>
-            </w:pPr>
-            <w:r>
-              <w:rPr>
-                <w:noProof/>
-              </w:rPr>
-              <w:t>Validación de Ownership en API</w:t>
-            </w:r>
-          </w:p>
-        </w:tc>
-        <w:tc>
-          <w:tcPr>
-            <w:tcW w:w="2237" w:type="dxa"/>
-          </w:tcPr>
-          <w:p>
-            <w:pPr>
-              <w:pStyle w:val="Contenido"/>
-              <w:jc w:val="center"/>
-              <w:rPr>
-                <w:noProof/>
-              </w:rPr>
-            </w:pPr>
-            <w:r>
-              <w:rPr>
-                <w:noProof/>
-              </w:rPr>
-              <w:t>72h</w:t>
-            </w:r>
-          </w:p>
-        </w:tc>
-      </w:tr>
-      <w:tr>
-        <w:trPr>
-          <w:trHeight w:val="607"/>
-        </w:trPr>
-        <w:tc>
-          <w:tcPr>
-            <w:tcW w:w="1735" w:type="dxa"/>
-          </w:tcPr>
-          <w:p>
-            <w:pPr>
-              <w:pStyle w:val="Contenido"/>
-              <w:rPr>
-                <w:noProof/>
-              </w:rPr>
-            </w:pPr>
-            <w:r>
-              <w:rPr>
-                <w:noProof/>
-              </w:rPr>
-              <w:t>Media</w:t>
-            </w:r>
-          </w:p>
-        </w:tc>
-        <w:tc>
-          <w:tcPr>
-            <w:tcW w:w="1284" w:type="dxa"/>
-          </w:tcPr>
-          <w:p>
-            <w:pPr>
-              <w:pStyle w:val="Contenido"/>
-              <w:jc w:val="center"/>
-              <w:rPr>
-                <w:noProof/>
-              </w:rPr>
-            </w:pPr>
-            <w:r>
-              <w:rPr>
-                <w:noProof/>
-              </w:rPr>
-              <w:t>H-004</w:t>
-            </w:r>
-          </w:p>
-        </w:tc>
-        <w:tc>
-          <w:tcPr>
-            <w:tcW w:w="4720" w:type="dxa"/>
-          </w:tcPr>
-          <w:p>
-            <w:pPr>
-              <w:pStyle w:val="Contenido"/>
-              <w:rPr>
-                <w:noProof/>
-              </w:rPr>
-            </w:pPr>
-            <w:r>
-              <w:rPr>
-                <w:noProof/>
-              </w:rPr>
-              <w:t>Configuración de cabeceras http</w:t>
-            </w:r>
-          </w:p>
-        </w:tc>
-        <w:tc>
-          <w:tcPr>
-            <w:tcW w:w="2237" w:type="dxa"/>
-          </w:tcPr>
-          <w:p>
-            <w:pPr>
-              <w:pStyle w:val="Contenido"/>
-              <w:jc w:val="center"/>
-              <w:rPr>
-                <w:noProof/>
-              </w:rPr>
-            </w:pPr>
-            <w:r>
-              <w:rPr>
-                <w:noProof/>
-              </w:rPr>
-              <w:t>1 semana</w:t>
-            </w:r>
-          </w:p>
-        </w:tc>
-      </w:tr>
-      <w:tr>
-        <w:trPr>
-          <w:trHeight w:val="587"/>
-        </w:trPr>
-        <w:tc>
-          <w:tcPr>
-            <w:tcW w:w="1735" w:type="dxa"/>
-          </w:tcPr>
-          <w:p>
-            <w:pPr>
-              <w:pStyle w:val="Contenido"/>
-              <w:rPr>
-                <w:noProof/>
-              </w:rPr>
-            </w:pPr>
-            <w:r>
-              <w:rPr>
-                <w:noProof/>
-              </w:rPr>
-              <w:t>Medi</w:t>
-            </w:r>
-            <w:r>
-              <w:rPr>
-                <w:noProof/>
-              </w:rPr>
-              <w:t>a</w:t>
-            </w:r>
-          </w:p>
-        </w:tc>
-        <w:tc>
-          <w:tcPr>
-            <w:tcW w:w="1284" w:type="dxa"/>
-          </w:tcPr>
-          <w:p>
-            <w:pPr>
-              <w:pStyle w:val="Contenido"/>
-              <w:jc w:val="center"/>
-              <w:rPr>
-                <w:noProof/>
-              </w:rPr>
-            </w:pPr>
-            <w:r>
-              <w:rPr>
-                <w:noProof/>
-              </w:rPr>
-              <w:t>H-005</w:t>
-            </w:r>
-          </w:p>
-        </w:tc>
-        <w:tc>
-          <w:tcPr>
-            <w:tcW w:w="4720" w:type="dxa"/>
-          </w:tcPr>
-          <w:p>
-            <w:pPr>
-              <w:pStyle w:val="Contenido"/>
-              <w:rPr>
-                <w:noProof/>
-              </w:rPr>
-            </w:pPr>
-            <w:r>
-              <w:rPr>
-                <w:noProof/>
-              </w:rPr>
-              <w:t>Refactorización de Sanitización</w:t>
-            </w:r>
-          </w:p>
-        </w:tc>
-        <w:tc>
-          <w:tcPr>
-            <w:tcW w:w="2237" w:type="dxa"/>
-          </w:tcPr>
-          <w:p>
-            <w:pPr>
-              <w:pStyle w:val="Contenido"/>
-              <w:jc w:val="center"/>
-              <w:rPr>
-                <w:noProof/>
-              </w:rPr>
-            </w:pPr>
-            <w:r>
-              <w:rPr>
-                <w:noProof/>
-              </w:rPr>
-              <w:t>1 semana</w:t>
-            </w:r>
-          </w:p>
-        </w:tc>
-      </w:tr>
-    </w:tbl>
-    <w:p>
-      <w:pPr>
-        <w:pStyle w:val="Contenido"/>
-      </w:pPr>
+      <w:pPr>
+        <w:rPr>
+          <w:noProof/>
+        </w:rPr>
+      </w:pPr>
+      <w:r>
+        <w:rPr>
+          <w:noProof/>
+        </w:rPr>
+        <w:t>MARCO METODOLÓGICO: OWASP WSTG 4.0</w:t>
+      </w:r>
     </w:p>
     <w:p>
-      <w:r>
-        <w:t>GUIA TECNICA DE REMEDIACIÓN</w:t>
-      </w:r>
-    </w:p>
-    <w:p/>
-    <w:p>
-      <w:pPr>
-        <w:pStyle w:val="Contenido"/>
-        <w:spacing w:line="360" w:lineRule="auto"/>
-        <w:jc w:val="both"/>
-      </w:pPr>
-      <w:r>
-        <w:t>R-01</w:t>
-      </w:r>
-      <w:r>
-        <w:t>: ACTUALIZACIÓN DE DEPENDENCIAS (MITIGACIÓN H-0</w:t>
-      </w:r>
-      <w:r>
-        <w:t>0</w:t>
-      </w:r>
-      <w:r>
-        <w:t>1)</w:t>
-      </w:r>
-    </w:p>
-    <w:p>
-      <w:pPr>
-        <w:pStyle w:val="Contenido"/>
-        <w:numPr>
-          <w:ilvl w:val="0"/>
-          <w:numId w:val="2"/>
-        </w:numPr>
-        <w:spacing w:line="360" w:lineRule="auto"/>
-        <w:jc w:val="both"/>
-      </w:pPr>
-      <w:r>
-        <w:t xml:space="preserve">Acción: Sustituir el </w:t>
-      </w:r>
-      <w:proofErr w:type="gramStart"/>
-      <w:r>
-        <w:t>driver</w:t>
-      </w:r>
-      <w:proofErr w:type="gramEnd"/>
-      <w:r>
-        <w:t xml:space="preserve"> </w:t>
-      </w:r>
-      <w:proofErr w:type="spellStart"/>
-      <w:r>
-        <w:t>legacy</w:t>
-      </w:r>
-      <w:proofErr w:type="spellEnd"/>
-      <w:r>
-        <w:t xml:space="preserve"> '</w:t>
-      </w:r>
-      <w:proofErr w:type="spellStart"/>
-      <w:r>
-        <w:t>mysql</w:t>
-      </w:r>
-      <w:proofErr w:type="spellEnd"/>
-      <w:r>
-        <w:t>' por 'mysql2', el cual es más seguro y compatible con el pool de conexiones actual.</w:t>
-      </w:r>
-    </w:p>
-    <w:p>
-      <w:pPr>
-        <w:pStyle w:val="Contenido"/>
-        <w:numPr>
-          <w:ilvl w:val="0"/>
-          <w:numId w:val="2"/>
-        </w:numPr>
-        <w:spacing w:line="360" w:lineRule="auto"/>
-        <w:jc w:val="both"/>
-      </w:pPr>
-      <w:r>
-        <w:t xml:space="preserve">Comando: $ cd </w:t>
-      </w:r>
-      <w:proofErr w:type="gramStart"/>
-      <w:r>
-        <w:t>server</w:t>
-      </w:r>
-      <w:proofErr w:type="gramEnd"/>
-      <w:r>
-        <w:t xml:space="preserve"> &amp;&amp; </w:t>
-      </w:r>
-      <w:proofErr w:type="spellStart"/>
-      <w:r>
-        <w:t>npm</w:t>
-      </w:r>
-      <w:proofErr w:type="spellEnd"/>
-      <w:r>
-        <w:t xml:space="preserve"> </w:t>
-      </w:r>
-      <w:proofErr w:type="spellStart"/>
-      <w:r>
-        <w:t>uninstall</w:t>
-      </w:r>
-      <w:proofErr w:type="spellEnd"/>
-      <w:r>
-        <w:t xml:space="preserve"> </w:t>
-      </w:r>
-      <w:proofErr w:type="spellStart"/>
-      <w:r>
-        <w:t>mysql</w:t>
-      </w:r>
-      <w:proofErr w:type="spellEnd"/>
-      <w:r>
-        <w:t xml:space="preserve"> &amp;&amp; </w:t>
-      </w:r>
-      <w:proofErr w:type="spellStart"/>
-      <w:r>
-        <w:t>npm</w:t>
-      </w:r>
-      <w:proofErr w:type="spellEnd"/>
-      <w:r>
-        <w:t xml:space="preserve"> </w:t>
-      </w:r>
-      <w:proofErr w:type="spellStart"/>
-      <w:r>
-        <w:t>install</w:t>
-      </w:r>
-      <w:proofErr w:type="spellEnd"/>
-      <w:r>
-        <w:t xml:space="preserve"> mysql2</w:t>
-      </w:r>
-    </w:p>
-    <w:p>
-      <w:pPr>
-        <w:pStyle w:val="Contenido"/>
-        <w:numPr>
-          <w:ilvl w:val="0"/>
-          <w:numId w:val="2"/>
-        </w:numPr>
-        <w:spacing w:line="360" w:lineRule="auto"/>
-        <w:jc w:val="both"/>
-      </w:pPr>
-      <w:r>
-        <w:t>Nota: Actualizar la configuración de conexión en `server/</w:t>
-      </w:r>
-      <w:proofErr w:type="spellStart"/>
-      <w:r>
-        <w:t>utills</w:t>
-      </w:r>
-      <w:proofErr w:type="spellEnd"/>
-      <w:r>
-        <w:t>/db.js` para asegurar la</w:t>
-      </w:r>
-      <w:r>
-        <w:t xml:space="preserve"> </w:t>
-      </w:r>
-      <w:r>
-        <w:t xml:space="preserve">compatibilidad con el nuevo </w:t>
-      </w:r>
-      <w:proofErr w:type="gramStart"/>
-      <w:r>
-        <w:t>driver</w:t>
-      </w:r>
-      <w:proofErr w:type="gramEnd"/>
-      <w:r>
-        <w:t>.</w:t>
-      </w:r>
-    </w:p>
-    <w:p>
-      <w:pPr>
-        <w:pStyle w:val="Contenido"/>
-        <w:spacing w:line="360" w:lineRule="auto"/>
-        <w:jc w:val="both"/>
-      </w:pPr>
-    </w:p>
-    <w:p>
-      <w:pPr>
-        <w:pStyle w:val="Contenido"/>
-        <w:spacing w:line="360" w:lineRule="auto"/>
-        <w:jc w:val="both"/>
+      <w:pPr>
+        <w:rPr>
+          <w:noProof/>
+        </w:rPr>
       </w:pPr>
     </w:p>
     <w:p>
@@ -1463,91 +770,14 @@
         <w:spacing w:line="360" w:lineRule="auto"/>
         <w:jc w:val="both"/>
         <w:rPr>
-          <w:b/>
-          <w:bCs/>
+          <w:noProof/>
         </w:rPr>
       </w:pPr>
       <w:r>
         <w:rPr>
-          <w:b/>
-          <w:bCs/>
+          <w:noProof/>
         </w:rPr>
-        <w:lastRenderedPageBreak/>
-        <w:t>R-02: PROTECCIÓN CONTRA CSRF (MITIGACIÓN H-0</w:t>
-      </w:r>
-      <w:r>
-        <w:rPr>
-          <w:b/>
-          <w:bCs/>
-        </w:rPr>
-        <w:t>0</w:t>
-      </w:r>
-      <w:r>
-        <w:rPr>
-          <w:b/>
-          <w:bCs/>
-        </w:rPr>
-        <w:t>2)</w:t>
-      </w:r>
-    </w:p>
-    <w:p>
-      <w:pPr>
-        <w:pStyle w:val="Contenido"/>
-        <w:spacing w:line="360" w:lineRule="auto"/>
-        <w:jc w:val="both"/>
-      </w:pPr>
-      <w:r>
-        <w:t>- Acción: Implementar el uso de cookies con el atributo '</w:t>
-      </w:r>
-      <w:proofErr w:type="spellStart"/>
-      <w:r>
-        <w:t>SameSite</w:t>
-      </w:r>
-      <w:proofErr w:type="spellEnd"/>
-      <w:r>
-        <w:t>=</w:t>
-      </w:r>
-      <w:proofErr w:type="spellStart"/>
-      <w:r>
-        <w:t>Strict</w:t>
-      </w:r>
-      <w:proofErr w:type="spellEnd"/>
-      <w:r>
-        <w:t>' y validar el origen de las peticiones (</w:t>
-      </w:r>
-      <w:proofErr w:type="spellStart"/>
-      <w:r>
-        <w:t>Origin</w:t>
-      </w:r>
-      <w:proofErr w:type="spellEnd"/>
-      <w:r>
-        <w:t>/</w:t>
-      </w:r>
-      <w:proofErr w:type="spellStart"/>
-      <w:r>
-        <w:t>Referer</w:t>
-      </w:r>
-      <w:proofErr w:type="spellEnd"/>
-      <w:r>
-        <w:t xml:space="preserve"> </w:t>
-      </w:r>
-      <w:proofErr w:type="spellStart"/>
-      <w:r>
-        <w:t>headers</w:t>
-      </w:r>
-      <w:proofErr w:type="spellEnd"/>
-      <w:r>
-        <w:t>) en el servidor Express.</w:t>
-      </w:r>
-    </w:p>
-    <w:p>
-      <w:pPr>
-        <w:pStyle w:val="Contenido"/>
-        <w:spacing w:line="360" w:lineRule="auto"/>
-        <w:jc w:val="both"/>
-      </w:pPr>
-      <w:r>
-        <w:t>- Recomendación de Código:</w:t>
+        <w:t>La ejecución del Pentest se rige por la guía de pruebas de seguridad web de OWASP (Web Security Testing Guide), estructurada en las siguientes etapas:</w:t>
       </w:r>
     </w:p>
     <w:p>
@@ -1556,54 +786,9 @@
         <w:spacing w:line="360" w:lineRule="auto"/>
         <w:jc w:val="both"/>
         <w:rPr>
-          <w:rFonts w:ascii="Consolas" w:hAnsi="Consolas"/>
+          <w:noProof/>
         </w:rPr>
       </w:pPr>
-      <w:r>
-        <w:t xml:space="preserve"> </w:t>
-      </w:r>
-      <w:r>
-        <w:tab/>
-      </w:r>
-      <w:r>
-        <w:t xml:space="preserve"> </w:t>
-      </w:r>
-      <w:proofErr w:type="spellStart"/>
-      <w:proofErr w:type="gramStart"/>
-      <w:r>
-        <w:rPr>
-          <w:rFonts w:ascii="Consolas" w:hAnsi="Consolas"/>
-        </w:rPr>
-        <w:t>app.use</w:t>
-      </w:r>
-      <w:proofErr w:type="spellEnd"/>
-      <w:r>
-        <w:rPr>
-          <w:rFonts w:ascii="Consolas" w:hAnsi="Consolas"/>
-        </w:rPr>
-        <w:t>(</w:t>
-      </w:r>
-      <w:proofErr w:type="spellStart"/>
-      <w:r>
-        <w:rPr>
-          <w:rFonts w:ascii="Consolas" w:hAnsi="Consolas"/>
-        </w:rPr>
-        <w:t>session</w:t>
-      </w:r>
-      <w:proofErr w:type="spellEnd"/>
-      <w:r>
-        <w:rPr>
-          <w:rFonts w:ascii="Consolas" w:hAnsi="Consolas"/>
-        </w:rPr>
-        <w:t>(</w:t>
-      </w:r>
-      <w:proofErr w:type="gramEnd"/>
-      <w:r>
-        <w:rPr>
-          <w:rFonts w:ascii="Consolas" w:hAnsi="Consolas"/>
-        </w:rPr>
-        <w:t>{</w:t>
-      </w:r>
     </w:p>
     <w:p>
       <w:pPr>
@@ -1611,96 +796,40 @@
         <w:spacing w:line="360" w:lineRule="auto"/>
         <w:jc w:val="both"/>
         <w:rPr>
-          <w:rFonts w:ascii="Consolas" w:hAnsi="Consolas"/>
+          <w:noProof/>
         </w:rPr>
       </w:pPr>
       <w:r>
         <w:rPr>
-          <w:rFonts w:ascii="Consolas" w:hAnsi="Consolas"/>
+          <w:b/>
+          <w:bCs/>
+          <w:noProof/>
         </w:rPr>
-        <w:t xml:space="preserve">    </w:t>
+        <w:t>A. RECONOCIMIENTO (RECONNAISSANCE):</w:t>
       </w:r>
       <w:r>
         <w:rPr>
-          <w:rFonts w:ascii="Consolas" w:hAnsi="Consolas"/>
+          <w:noProof/>
         </w:rPr>
-        <w:tab/>
+        <w:t xml:space="preserve"> </w:t>
       </w:r>
       <w:r>
         <w:rPr>
-          <w:rFonts w:ascii="Consolas" w:hAnsi="Consolas"/>
+          <w:noProof/>
         </w:rPr>
-        <w:tab/>
+        <w:t>Identificación de la superficie de ataque, enumeración de subdominios, huellas</w:t>
       </w:r>
       <w:r>
         <w:rPr>
-          <w:rFonts w:ascii="Consolas" w:hAnsi="Consolas"/>
+          <w:noProof/>
         </w:rPr>
-        <w:t xml:space="preserve">cookie: </w:t>
-      </w:r>
-      <w:proofErr w:type="gramStart"/>
+        <w:t xml:space="preserve"> </w:t>
+      </w:r>
       <w:r>
         <w:rPr>
-          <w:rFonts w:ascii="Consolas" w:hAnsi="Consolas"/>
+          <w:noProof/>
         </w:rPr>
-        <w:t xml:space="preserve">{ </w:t>
-      </w:r>
-      <w:proofErr w:type="spellStart"/>
-      <w:r>
-        <w:rPr>
-          <w:rFonts w:ascii="Consolas" w:hAnsi="Consolas"/>
-        </w:rPr>
-        <w:t>sameSite</w:t>
-      </w:r>
-      <w:proofErr w:type="spellEnd"/>
-      <w:proofErr w:type="gramEnd"/>
-      <w:r>
-        <w:rPr>
-          <w:rFonts w:ascii="Consolas" w:hAnsi="Consolas"/>
-        </w:rPr>
-        <w:t>: '</w:t>
-      </w:r>
-      <w:proofErr w:type="spellStart"/>
-      <w:r>
-        <w:rPr>
-          <w:rFonts w:ascii="Consolas" w:hAnsi="Consolas"/>
-        </w:rPr>
-        <w:t>strict</w:t>
-      </w:r>
-      <w:proofErr w:type="spellEnd"/>
-      <w:r>
-        <w:rPr>
-          <w:rFonts w:ascii="Consolas" w:hAnsi="Consolas"/>
-        </w:rPr>
-        <w:t xml:space="preserve">', </w:t>
-      </w:r>
-      <w:proofErr w:type="spellStart"/>
-      <w:r>
-        <w:rPr>
-          <w:rFonts w:ascii="Consolas" w:hAnsi="Consolas"/>
-        </w:rPr>
-        <w:t>secure</w:t>
-      </w:r>
-      <w:proofErr w:type="spellEnd"/>
-      <w:r>
-        <w:rPr>
-          <w:rFonts w:ascii="Consolas" w:hAnsi="Consolas"/>
-        </w:rPr>
-        <w:t xml:space="preserve">: </w:t>
-      </w:r>
-      <w:proofErr w:type="gramStart"/>
-      <w:r>
-        <w:rPr>
-          <w:rFonts w:ascii="Consolas" w:hAnsi="Consolas"/>
-        </w:rPr>
-        <w:t>true }</w:t>
-      </w:r>
-      <w:proofErr w:type="gramEnd"/>
-      <w:r>
-        <w:rPr>
-          <w:rFonts w:ascii="Consolas" w:hAnsi="Consolas"/>
-        </w:rPr>
-        <w:t>,</w:t>
+        <w:t>digitales de tecnologías (Next.js, Node.js,Express) y mapeo de endpoints de la API.</w:t>
       </w:r>
     </w:p>
     <w:p>
@@ -1709,69 +838,39 @@
         <w:spacing w:line="360" w:lineRule="auto"/>
         <w:jc w:val="both"/>
         <w:rPr>
-          <w:rFonts w:ascii="Consolas" w:hAnsi="Consolas"/>
+          <w:noProof/>
         </w:rPr>
       </w:pPr>
       <w:r>
         <w:rPr>
-          <w:rFonts w:ascii="Consolas" w:hAnsi="Consolas"/>
+          <w:b/>
+          <w:bCs/>
+          <w:noProof/>
         </w:rPr>
-        <w:t xml:space="preserve">    </w:t>
+        <w:t>B. DESCUBRIMIENTO DE VULNERABILIDADES (VULNERABILITY SCANNING):</w:t>
       </w:r>
       <w:r>
         <w:rPr>
-          <w:rFonts w:ascii="Consolas" w:hAnsi="Consolas"/>
-        </w:rPr>
-        <w:tab/>
-      </w:r>
-      <w:r>
-        <w:rPr>
-          <w:rFonts w:ascii="Consolas" w:hAnsi="Consolas"/>
-        </w:rPr>
-        <w:tab/>
-      </w:r>
-      <w:r>
-        <w:rPr>
-          <w:rFonts w:ascii="Consolas" w:hAnsi="Consolas"/>
-        </w:rPr>
-        <w:t xml:space="preserve">// ... </w:t>
-      </w:r>
-      <w:proofErr w:type="spellStart"/>
-      <w:r>
-        <w:rPr>
-          <w:rFonts w:ascii="Consolas" w:hAnsi="Consolas"/>
-        </w:rPr>
-        <w:t>rest</w:t>
-      </w:r>
-      <w:proofErr w:type="spellEnd"/>
-      <w:r>
-        <w:rPr>
-          <w:rFonts w:ascii="Consolas" w:hAnsi="Consolas"/>
+          <w:b/>
+          <w:bCs/>
+          <w:noProof/>
         </w:rPr>
         <w:t xml:space="preserve"> </w:t>
       </w:r>
-      <w:proofErr w:type="spellStart"/>
       <w:r>
         <w:rPr>
-          <w:rFonts w:ascii="Consolas" w:hAnsi="Consolas"/>
+          <w:b/>
+          <w:bCs/>
+          <w:noProof/>
         </w:rPr>
-        <w:t>of</w:t>
-      </w:r>
-      <w:proofErr w:type="spellEnd"/>
+        <w:t>Uso</w:t>
+      </w:r>
       <w:r>
         <w:rPr>
-          <w:rFonts w:ascii="Consolas" w:hAnsi="Consolas"/>
+          <w:noProof/>
         </w:rPr>
-        <w:t xml:space="preserve"> </w:t>
-      </w:r>
-      <w:proofErr w:type="spellStart"/>
-      <w:r>
-        <w:rPr>
-          <w:rFonts w:ascii="Consolas" w:hAnsi="Consolas"/>
-        </w:rPr>
-        <w:t>config</w:t>
-      </w:r>
-      <w:proofErr w:type="spellEnd"/>
+        <w:t xml:space="preserve"> de herramientas automatizadas y técnicas manuales para identificar puntos de entrada, parámetros manipulables y configuraciones débiles.</w:t>
+      </w:r>
     </w:p>
     <w:p>
       <w:pPr>
@@ -1779,26 +878,28 @@
         <w:spacing w:line="360" w:lineRule="auto"/>
         <w:jc w:val="both"/>
         <w:rPr>
-          <w:rFonts w:ascii="Consolas" w:hAnsi="Consolas"/>
+          <w:noProof/>
         </w:rPr>
       </w:pPr>
       <w:r>
         <w:rPr>
-          <w:rFonts w:ascii="Consolas" w:hAnsi="Consolas"/>
+          <w:b/>
+          <w:bCs/>
+          <w:noProof/>
+        </w:rPr>
+        <w:t>C. EXPLOTACIÓN (EXPLOITATION):</w:t>
+      </w:r>
+      <w:r>
+        <w:rPr>
+          <w:noProof/>
         </w:rPr>
         <w:t xml:space="preserve"> </w:t>
       </w:r>
       <w:r>
         <w:rPr>
-          <w:rFonts w:ascii="Consolas" w:hAnsi="Consolas"/>
+          <w:noProof/>
         </w:rPr>
-        <w:tab/>
-      </w:r>
-      <w:r>
-        <w:rPr>
-          <w:rFonts w:ascii="Consolas" w:hAnsi="Consolas"/>
-        </w:rPr>
-        <w:t xml:space="preserve"> }));</w:t>
+        <w:t>Validación de hallazgos mediante el intento controlado de explotar las debilidades encontradas (Inyecciones, Bypass de Autenticación, IDOR).</w:t>
       </w:r>
     </w:p>
     <w:p>
@@ -1807,88 +908,45 @@
         <w:spacing w:line="360" w:lineRule="auto"/>
         <w:jc w:val="both"/>
         <w:rPr>
-          <w:b/>
-          <w:bCs/>
+          <w:noProof/>
         </w:rPr>
       </w:pPr>
       <w:r>
         <w:rPr>
           <w:b/>
           <w:bCs/>
+          <w:noProof/>
         </w:rPr>
-        <w:t>R-03: BASTIONADO DE CABECERAS HTTP (MITIGACIÓN H-03)</w:t>
+        <w:t>D. POST-EXPLOTACIÓN Y ANÁLISIS DE IMPACTO:</w:t>
+      </w:r>
+      <w:r>
+        <w:rPr>
+          <w:noProof/>
+        </w:rPr>
+        <w:t xml:space="preserve"> </w:t>
+      </w:r>
+      <w:r>
+        <w:rPr>
+          <w:noProof/>
+        </w:rPr>
+        <w:t>Evaluación de la profundidad del compromiso (movimiento lateral, acceso a la base de datos, exfiltración de datos sensibles de clientes).</w:t>
       </w:r>
     </w:p>
     <w:p>
       <w:pPr>
         <w:pStyle w:val="Contenido"/>
-        <w:numPr>
-          <w:ilvl w:val="0"/>
-          <w:numId w:val="2"/>
-        </w:numPr>
-        <w:spacing w:line="360" w:lineRule="auto"/>
-        <w:jc w:val="both"/>
-      </w:pPr>
-      <w:r>
-        <w:t>Acción: Integrar el middleware '</w:t>
-      </w:r>
-      <w:proofErr w:type="spellStart"/>
-      <w:r>
-        <w:t>helmet</w:t>
-      </w:r>
-      <w:proofErr w:type="spellEnd"/>
-      <w:r>
-        <w:t>' en la aplicación Express para configurar automáticamente cabeceras de seguridad estándar.</w:t>
-      </w:r>
+        <w:rPr>
+          <w:noProof/>
+        </w:rPr>
+      </w:pPr>
     </w:p>
     <w:p>
       <w:pPr>
         <w:pStyle w:val="Contenido"/>
-        <w:numPr>
-          <w:ilvl w:val="0"/>
-          <w:numId w:val="2"/>
-        </w:numPr>
-        <w:spacing w:line="360" w:lineRule="auto"/>
-        <w:jc w:val="both"/>
-      </w:pPr>
-      <w:r>
-        <w:t xml:space="preserve">Comando: $ </w:t>
-      </w:r>
-      <w:proofErr w:type="spellStart"/>
-      <w:r>
-        <w:t>npm</w:t>
-      </w:r>
-      <w:proofErr w:type="spellEnd"/>
-      <w:r>
-        <w:t xml:space="preserve"> </w:t>
-      </w:r>
-      <w:proofErr w:type="spellStart"/>
-      <w:r>
-        <w:t>install</w:t>
-      </w:r>
-      <w:proofErr w:type="spellEnd"/>
-      <w:r>
-        <w:t xml:space="preserve"> </w:t>
-      </w:r>
-      <w:proofErr w:type="spellStart"/>
-      <w:r>
-        <w:t>helmet</w:t>
-      </w:r>
-      <w:proofErr w:type="spellEnd"/>
-    </w:p>
-    <w:p>
-      <w:pPr>
-        <w:pStyle w:val="Contenido"/>
-        <w:numPr>
-          <w:ilvl w:val="0"/>
-          <w:numId w:val="2"/>
-        </w:numPr>
-        <w:spacing w:line="360" w:lineRule="auto"/>
-        <w:jc w:val="both"/>
-      </w:pPr>
-      <w:r>
-        <w:t>Implementación en app.js:</w:t>
-      </w:r>
+        <w:rPr>
+          <w:noProof/>
+        </w:rPr>
+      </w:pPr>
     </w:p>
     <w:p>
       <w:pPr>
@@ -1896,179 +954,37 @@
         <w:spacing w:line="360" w:lineRule="auto"/>
         <w:jc w:val="both"/>
         <w:rPr>
-          <w:rFonts w:ascii="Consolas" w:hAnsi="Consolas"/>
+          <w:noProof/>
         </w:rPr>
       </w:pPr>
-      <w:r>
-        <w:t xml:space="preserve">  </w:t>
-      </w:r>
-      <w:r>
-        <w:tab/>
-      </w:r>
-      <w:r>
-        <w:tab/>
-      </w:r>
-      <w:proofErr w:type="spellStart"/>
-      <w:r>
-        <w:rPr>
-          <w:rFonts w:ascii="Consolas" w:hAnsi="Consolas"/>
-        </w:rPr>
-        <w:t>const</w:t>
-      </w:r>
-      <w:proofErr w:type="spellEnd"/>
-      <w:r>
-        <w:rPr>
-          <w:rFonts w:ascii="Consolas" w:hAnsi="Consolas"/>
-        </w:rPr>
-        <w:t xml:space="preserve"> </w:t>
-      </w:r>
-      <w:proofErr w:type="spellStart"/>
-      <w:r>
-        <w:rPr>
-          <w:rFonts w:ascii="Consolas" w:hAnsi="Consolas"/>
-        </w:rPr>
-        <w:t>helmet</w:t>
-      </w:r>
-      <w:proofErr w:type="spellEnd"/>
-      <w:r>
-        <w:rPr>
-          <w:rFonts w:ascii="Consolas" w:hAnsi="Consolas"/>
-        </w:rPr>
-        <w:t xml:space="preserve"> = </w:t>
-      </w:r>
-      <w:proofErr w:type="spellStart"/>
-      <w:r>
-        <w:rPr>
-          <w:rFonts w:ascii="Consolas" w:hAnsi="Consolas"/>
-        </w:rPr>
-        <w:t>require</w:t>
-      </w:r>
-      <w:proofErr w:type="spellEnd"/>
-      <w:r>
-        <w:rPr>
-          <w:rFonts w:ascii="Consolas" w:hAnsi="Consolas"/>
-        </w:rPr>
-        <w:t>('</w:t>
-      </w:r>
-      <w:proofErr w:type="spellStart"/>
-      <w:r>
-        <w:rPr>
-          <w:rFonts w:ascii="Consolas" w:hAnsi="Consolas"/>
-        </w:rPr>
-        <w:t>helmet</w:t>
-      </w:r>
-      <w:proofErr w:type="spellEnd"/>
-      <w:r>
-        <w:rPr>
-          <w:rFonts w:ascii="Consolas" w:hAnsi="Consolas"/>
-        </w:rPr>
-        <w:t>');</w:t>
-      </w:r>
     </w:p>
     <w:p>
-      <w:pPr>
-        <w:pStyle w:val="Contenido"/>
-        <w:spacing w:line="360" w:lineRule="auto"/>
-        <w:jc w:val="both"/>
-        <w:rPr>
-          <w:rFonts w:ascii="Consolas" w:hAnsi="Consolas"/>
-        </w:rPr>
-      </w:pPr>
-      <w:r>
-        <w:rPr>
-          <w:rFonts w:ascii="Consolas" w:hAnsi="Consolas"/>
-        </w:rPr>
-        <w:t xml:space="preserve">  </w:t>
-      </w:r>
-      <w:r>
-        <w:rPr>
-          <w:rFonts w:ascii="Consolas" w:hAnsi="Consolas"/>
-        </w:rPr>
-        <w:tab/>
-      </w:r>
-      <w:r>
-        <w:rPr>
-          <w:rFonts w:ascii="Consolas" w:hAnsi="Consolas"/>
-        </w:rPr>
-        <w:tab/>
-      </w:r>
-      <w:proofErr w:type="spellStart"/>
-      <w:r>
-        <w:rPr>
-          <w:rFonts w:ascii="Consolas" w:hAnsi="Consolas"/>
-        </w:rPr>
-        <w:t>app.use</w:t>
-      </w:r>
-      <w:proofErr w:type="spellEnd"/>
-      <w:r>
-        <w:rPr>
-          <w:rFonts w:ascii="Consolas" w:hAnsi="Consolas"/>
-        </w:rPr>
-        <w:t>(</w:t>
-      </w:r>
-      <w:proofErr w:type="spellStart"/>
-      <w:proofErr w:type="gramStart"/>
-      <w:r>
-        <w:rPr>
-          <w:rFonts w:ascii="Consolas" w:hAnsi="Consolas"/>
-        </w:rPr>
-        <w:t>helmet</w:t>
-      </w:r>
-      <w:proofErr w:type="spellEnd"/>
-      <w:r>
-        <w:rPr>
-          <w:rFonts w:ascii="Consolas" w:hAnsi="Consolas"/>
-        </w:rPr>
-        <w:t>(</w:t>
-      </w:r>
-      <w:proofErr w:type="gramEnd"/>
-      <w:r>
-        <w:rPr>
-          <w:rFonts w:ascii="Consolas" w:hAnsi="Consolas"/>
-        </w:rPr>
-        <w:t>));</w:t>
+      <w:r>
+        <w:lastRenderedPageBreak/>
+        <w:t>ALCANCE TÉCNICO</w:t>
       </w:r>
     </w:p>
-    <w:p>
-      <w:pPr>
-        <w:pStyle w:val="Contenido"/>
-        <w:spacing w:line="360" w:lineRule="auto"/>
-        <w:jc w:val="both"/>
-        <w:rPr>
-          <w:rFonts w:ascii="Consolas" w:hAnsi="Consolas"/>
-        </w:rPr>
-      </w:pPr>
-    </w:p>
-    <w:p>
-      <w:pPr>
-        <w:pStyle w:val="Contenido"/>
-        <w:spacing w:line="360" w:lineRule="auto"/>
-        <w:jc w:val="both"/>
-        <w:rPr>
-          <w:b/>
-          <w:bCs/>
-        </w:rPr>
-      </w:pPr>
-      <w:r>
-        <w:rPr>
-          <w:b/>
-          <w:bCs/>
-        </w:rPr>
-        <w:t>R-04: CONTROL DE ACCESO A NIVEL DE OBJETO (MITIGACIÓN H-04)</w:t>
-      </w:r>
-    </w:p>
+    <w:p/>
     <w:p>
       <w:pPr>
         <w:pStyle w:val="Contenido"/>
         <w:numPr>
           <w:ilvl w:val="0"/>
-          <w:numId w:val="2"/>
+          <w:numId w:val="7"/>
         </w:numPr>
         <w:spacing w:line="360" w:lineRule="auto"/>
         <w:jc w:val="both"/>
       </w:pPr>
       <w:r>
-        <w:t>Acción: Modificar los controladores de pedidos para que la consulta no solo filtre por ID de pedido, sino también por el ID de usuario obtenido del token de sesión JWT.</w:t>
+        <w:t>Interfaz de Usuario (Front-</w:t>
+      </w:r>
+      <w:proofErr w:type="spellStart"/>
+      <w:r>
+        <w:t>end</w:t>
+      </w:r>
+      <w:proofErr w:type="spellEnd"/>
+      <w:r>
+        <w:t>): http://localhost:3000</w:t>
       </w:r>
     </w:p>
     <w:p>
@@ -2076,275 +992,21 @@
         <w:pStyle w:val="Contenido"/>
         <w:numPr>
           <w:ilvl w:val="0"/>
-          <w:numId w:val="2"/>
+          <w:numId w:val="7"/>
         </w:numPr>
         <w:spacing w:line="360" w:lineRule="auto"/>
         <w:jc w:val="both"/>
       </w:pPr>
       <w:r>
-        <w:t>Lógica Sugerida:</w:t>
-      </w:r>
-    </w:p>
-    <w:p>
-      <w:pPr>
-        <w:pStyle w:val="Contenido"/>
-        <w:spacing w:line="360" w:lineRule="auto"/>
-        <w:jc w:val="both"/>
-        <w:rPr>
-          <w:rFonts w:ascii="Consolas" w:hAnsi="Consolas"/>
-        </w:rPr>
-      </w:pPr>
-      <w:r>
-        <w:t xml:space="preserve"> </w:t>
-      </w:r>
-      <w:r>
-        <w:tab/>
-      </w:r>
-      <w:r>
-        <w:tab/>
-      </w:r>
-      <w:r>
-        <w:t xml:space="preserve"> </w:t>
+        <w:t>API de Negocio (Back-</w:t>
       </w:r>
       <w:proofErr w:type="spellStart"/>
       <w:r>
-        <w:rPr>
-          <w:rFonts w:ascii="Consolas" w:hAnsi="Consolas"/>
-        </w:rPr>
-        <w:t>const</w:t>
+        <w:t>end</w:t>
       </w:r>
       <w:proofErr w:type="spellEnd"/>
       <w:r>
-        <w:rPr>
-          <w:rFonts w:ascii="Consolas" w:hAnsi="Consolas"/>
-        </w:rPr>
-        <w:t xml:space="preserve"> </w:t>
-      </w:r>
-      <w:proofErr w:type="spellStart"/>
-      <w:r>
-        <w:rPr>
-          <w:rFonts w:ascii="Consolas" w:hAnsi="Consolas"/>
-        </w:rPr>
-        <w:t>order</w:t>
-      </w:r>
-      <w:proofErr w:type="spellEnd"/>
-      <w:r>
-        <w:rPr>
-          <w:rFonts w:ascii="Consolas" w:hAnsi="Consolas"/>
-        </w:rPr>
-        <w:t xml:space="preserve"> = </w:t>
-      </w:r>
-      <w:proofErr w:type="spellStart"/>
-      <w:r>
-        <w:rPr>
-          <w:rFonts w:ascii="Consolas" w:hAnsi="Consolas"/>
-        </w:rPr>
-        <w:t>await</w:t>
-      </w:r>
-      <w:proofErr w:type="spellEnd"/>
-      <w:r>
-        <w:rPr>
-          <w:rFonts w:ascii="Consolas" w:hAnsi="Consolas"/>
-        </w:rPr>
-        <w:t xml:space="preserve"> </w:t>
-      </w:r>
-      <w:proofErr w:type="spellStart"/>
-      <w:proofErr w:type="gramStart"/>
-      <w:r>
-        <w:rPr>
-          <w:rFonts w:ascii="Consolas" w:hAnsi="Consolas"/>
-        </w:rPr>
-        <w:t>prisma.customer</w:t>
-      </w:r>
-      <w:proofErr w:type="gramEnd"/>
-      <w:r>
-        <w:rPr>
-          <w:rFonts w:ascii="Consolas" w:hAnsi="Consolas"/>
-        </w:rPr>
-        <w:t>_</w:t>
-      </w:r>
-      <w:proofErr w:type="gramStart"/>
-      <w:r>
-        <w:rPr>
-          <w:rFonts w:ascii="Consolas" w:hAnsi="Consolas"/>
-        </w:rPr>
-        <w:t>order.findFirst</w:t>
-      </w:r>
-      <w:proofErr w:type="spellEnd"/>
-      <w:proofErr w:type="gramEnd"/>
-      <w:r>
-        <w:rPr>
-          <w:rFonts w:ascii="Consolas" w:hAnsi="Consolas"/>
-        </w:rPr>
-        <w:t>({</w:t>
-      </w:r>
-    </w:p>
-    <w:p>
-      <w:pPr>
-        <w:pStyle w:val="Contenido"/>
-        <w:spacing w:line="360" w:lineRule="auto"/>
-        <w:jc w:val="both"/>
-        <w:rPr>
-          <w:rFonts w:ascii="Consolas" w:hAnsi="Consolas"/>
-        </w:rPr>
-      </w:pPr>
-      <w:r>
-        <w:rPr>
-          <w:rFonts w:ascii="Consolas" w:hAnsi="Consolas"/>
-        </w:rPr>
-        <w:t xml:space="preserve">   </w:t>
-      </w:r>
-      <w:r>
-        <w:rPr>
-          <w:rFonts w:ascii="Consolas" w:hAnsi="Consolas"/>
-        </w:rPr>
-        <w:tab/>
-      </w:r>
-      <w:r>
-        <w:rPr>
-          <w:rFonts w:ascii="Consolas" w:hAnsi="Consolas"/>
-        </w:rPr>
-        <w:tab/>
-      </w:r>
-      <w:r>
-        <w:rPr>
-          <w:rFonts w:ascii="Consolas" w:hAnsi="Consolas"/>
-        </w:rPr>
-        <w:t xml:space="preserve"> </w:t>
-      </w:r>
-      <w:proofErr w:type="spellStart"/>
-      <w:r>
-        <w:rPr>
-          <w:rFonts w:ascii="Consolas" w:hAnsi="Consolas"/>
-        </w:rPr>
-        <w:t>where</w:t>
-      </w:r>
-      <w:proofErr w:type="spellEnd"/>
-      <w:r>
-        <w:rPr>
-          <w:rFonts w:ascii="Consolas" w:hAnsi="Consolas"/>
-        </w:rPr>
-        <w:t xml:space="preserve">: </w:t>
-      </w:r>
-      <w:proofErr w:type="gramStart"/>
-      <w:r>
-        <w:rPr>
-          <w:rFonts w:ascii="Consolas" w:hAnsi="Consolas"/>
-        </w:rPr>
-        <w:t>{ id</w:t>
-      </w:r>
-      <w:proofErr w:type="gramEnd"/>
-      <w:r>
-        <w:rPr>
-          <w:rFonts w:ascii="Consolas" w:hAnsi="Consolas"/>
-        </w:rPr>
-        <w:t xml:space="preserve">: </w:t>
-      </w:r>
-      <w:proofErr w:type="spellStart"/>
-      <w:r>
-        <w:rPr>
-          <w:rFonts w:ascii="Consolas" w:hAnsi="Consolas"/>
-        </w:rPr>
-        <w:t>orderId</w:t>
-      </w:r>
-      <w:proofErr w:type="spellEnd"/>
-      <w:r>
-        <w:rPr>
-          <w:rFonts w:ascii="Consolas" w:hAnsi="Consolas"/>
-        </w:rPr>
-        <w:t xml:space="preserve">, </w:t>
-      </w:r>
-      <w:proofErr w:type="spellStart"/>
-      <w:r>
-        <w:rPr>
-          <w:rFonts w:ascii="Consolas" w:hAnsi="Consolas"/>
-        </w:rPr>
-        <w:t>userId</w:t>
-      </w:r>
-      <w:proofErr w:type="spellEnd"/>
-      <w:r>
-        <w:rPr>
-          <w:rFonts w:ascii="Consolas" w:hAnsi="Consolas"/>
-        </w:rPr>
-        <w:t xml:space="preserve">: </w:t>
-      </w:r>
-      <w:proofErr w:type="spellStart"/>
-      <w:proofErr w:type="gramStart"/>
-      <w:r>
-        <w:rPr>
-          <w:rFonts w:ascii="Consolas" w:hAnsi="Consolas"/>
-        </w:rPr>
-        <w:t>currentUser.id</w:t>
-      </w:r>
-      <w:proofErr w:type="spellEnd"/>
-      <w:r>
-        <w:rPr>
-          <w:rFonts w:ascii="Consolas" w:hAnsi="Consolas"/>
-        </w:rPr>
-        <w:t xml:space="preserve"> }</w:t>
-      </w:r>
-      <w:proofErr w:type="gramEnd"/>
-    </w:p>
-    <w:p>
-      <w:pPr>
-        <w:pStyle w:val="Contenido"/>
-        <w:spacing w:line="360" w:lineRule="auto"/>
-        <w:jc w:val="both"/>
-        <w:rPr>
-          <w:rFonts w:ascii="Consolas" w:hAnsi="Consolas"/>
-        </w:rPr>
-      </w:pPr>
-      <w:r>
-        <w:rPr>
-          <w:rFonts w:ascii="Consolas" w:hAnsi="Consolas"/>
-        </w:rPr>
-        <w:t xml:space="preserve">  </w:t>
-      </w:r>
-      <w:r>
-        <w:rPr>
-          <w:rFonts w:ascii="Consolas" w:hAnsi="Consolas"/>
-        </w:rPr>
-        <w:tab/>
-      </w:r>
-      <w:r>
-        <w:rPr>
-          <w:rFonts w:ascii="Consolas" w:hAnsi="Consolas"/>
-        </w:rPr>
-        <w:tab/>
-      </w:r>
-      <w:r>
-        <w:rPr>
-          <w:rFonts w:ascii="Consolas" w:hAnsi="Consolas"/>
-        </w:rPr>
-        <w:t>});</w:t>
-      </w:r>
-    </w:p>
-    <w:p>
-      <w:pPr>
-        <w:pStyle w:val="Contenido"/>
-        <w:spacing w:line="360" w:lineRule="auto"/>
-        <w:jc w:val="both"/>
-        <w:rPr>
-          <w:rFonts w:ascii="Consolas" w:hAnsi="Consolas"/>
-        </w:rPr>
-      </w:pPr>
-    </w:p>
-    <w:p>
-      <w:pPr>
-        <w:pStyle w:val="Contenido"/>
-        <w:spacing w:line="360" w:lineRule="auto"/>
-        <w:jc w:val="both"/>
-        <w:rPr>
-          <w:b/>
-          <w:bCs/>
-        </w:rPr>
-      </w:pPr>
-      <w:r>
-        <w:rPr>
-          <w:b/>
-          <w:bCs/>
-        </w:rPr>
-        <w:t>R-05: CENTRALIZACIÓN DE LA SANITIZACIÓN (MITIGACIÓN H-05)</w:t>
+        <w:t>): http://localhost:5000/api</w:t>
       </w:r>
     </w:p>
     <w:p>
@@ -2352,94 +1014,206 @@
         <w:pStyle w:val="Contenido"/>
         <w:numPr>
           <w:ilvl w:val="0"/>
-          <w:numId w:val="2"/>
+          <w:numId w:val="7"/>
         </w:numPr>
         <w:spacing w:line="360" w:lineRule="auto"/>
         <w:jc w:val="both"/>
       </w:pPr>
       <w:r>
-        <w:t xml:space="preserve">Acción: Crear un middleware global que </w:t>
-      </w:r>
-      <w:proofErr w:type="spellStart"/>
-      <w:r>
-        <w:t>sanitice</w:t>
-      </w:r>
-      <w:proofErr w:type="spellEnd"/>
-      <w:r>
-        <w:t xml:space="preserve"> recursivamente todos los campos de</w:t>
-      </w:r>
-      <w:r>
-        <w:t xml:space="preserve"> </w:t>
-      </w:r>
-      <w:r>
-        <w:t>`</w:t>
-      </w:r>
-      <w:proofErr w:type="spellStart"/>
-      <w:proofErr w:type="gramStart"/>
-      <w:r>
-        <w:t>req.body</w:t>
-      </w:r>
-      <w:proofErr w:type="spellEnd"/>
-      <w:proofErr w:type="gramEnd"/>
-      <w:r>
-        <w:t>`, `</w:t>
-      </w:r>
-      <w:proofErr w:type="spellStart"/>
-      <w:proofErr w:type="gramStart"/>
-      <w:r>
-        <w:t>req.query</w:t>
-      </w:r>
-      <w:proofErr w:type="spellEnd"/>
-      <w:proofErr w:type="gramEnd"/>
-      <w:r>
-        <w:t>` y `</w:t>
-      </w:r>
-      <w:proofErr w:type="spellStart"/>
-      <w:proofErr w:type="gramStart"/>
-      <w:r>
-        <w:t>req.params</w:t>
-      </w:r>
-      <w:proofErr w:type="spellEnd"/>
-      <w:proofErr w:type="gramEnd"/>
-      <w:r>
-        <w:t>` utilizando la librería `</w:t>
-      </w:r>
-      <w:proofErr w:type="spellStart"/>
-      <w:r>
-        <w:t>dompurify</w:t>
-      </w:r>
-      <w:proofErr w:type="spellEnd"/>
-      <w:r>
-        <w:t>`.</w:t>
+        <w:t>Motor de Base de Datos: MySQL (Instancia Interna)</w:t>
       </w:r>
     </w:p>
     <w:p>
-      <w:r>
-        <w:lastRenderedPageBreak/>
-        <w:t>VALIDACIÓN POST-REMEDIACIÓN</w:t>
+      <w:pPr>
+        <w:pStyle w:val="Contenido"/>
+        <w:numPr>
+          <w:ilvl w:val="0"/>
+          <w:numId w:val="7"/>
+        </w:numPr>
+        <w:spacing w:line="360" w:lineRule="auto"/>
+        <w:jc w:val="both"/>
+      </w:pPr>
+      <w:r>
+        <w:t xml:space="preserve">Funciones Críticas: Registro, Inicio de Sesión, Carrito de Compras, Bulk </w:t>
+      </w:r>
+      <w:proofErr w:type="spellStart"/>
+      <w:r>
+        <w:t>Upload</w:t>
+      </w:r>
+      <w:proofErr w:type="spellEnd"/>
+      <w:r>
+        <w:t>.</w:t>
+      </w:r>
+    </w:p>
+    <w:p>
+      <w:pPr>
+        <w:pStyle w:val="Contenido"/>
+        <w:jc w:val="both"/>
+      </w:pPr>
+    </w:p>
+    <w:p>
+      <w:r>
+        <w:t>TIPOS DE PRUEBAS A REALIZAR</w:t>
       </w:r>
     </w:p>
     <w:p/>
     <w:p>
       <w:pPr>
         <w:pStyle w:val="Contenido"/>
+        <w:numPr>
+          <w:ilvl w:val="0"/>
+          <w:numId w:val="9"/>
+        </w:numPr>
         <w:spacing w:line="360" w:lineRule="auto"/>
         <w:jc w:val="both"/>
       </w:pPr>
       <w:r>
-        <w:t>Una vez aplicadas las correcciones, el equipo de ciberseguridad deberá realizar</w:t>
-      </w:r>
-      <w:r>
-        <w:t xml:space="preserve"> u</w:t>
-      </w:r>
-      <w:r>
-        <w:t xml:space="preserve">n reescaneo SAST/SCA para confirmar la eliminación de las </w:t>
-      </w:r>
-      <w:r>
-        <w:t>vulnerabilidades, así como hacer p</w:t>
-      </w:r>
-      <w:r>
-        <w:t>ruebas de penetración dirigidas para validar la robustez de los nuevos controles de acceso.</w:t>
+        <w:t>Pruebas de Gestión de Autenticación: Fuerza bruta, debilidad en sesiones y</w:t>
+      </w:r>
+      <w:r>
+        <w:t xml:space="preserve"> </w:t>
+      </w:r>
+      <w:r>
+        <w:t>recuperación de cuentas.</w:t>
+      </w:r>
+    </w:p>
+    <w:p>
+      <w:pPr>
+        <w:pStyle w:val="Contenido"/>
+        <w:numPr>
+          <w:ilvl w:val="0"/>
+          <w:numId w:val="9"/>
+        </w:numPr>
+        <w:spacing w:line="360" w:lineRule="auto"/>
+        <w:jc w:val="both"/>
+      </w:pPr>
+      <w:r>
+        <w:t xml:space="preserve">Pruebas de Validación de Entradas: SQL </w:t>
+      </w:r>
+      <w:proofErr w:type="spellStart"/>
+      <w:r>
+        <w:t>Injection</w:t>
+      </w:r>
+      <w:proofErr w:type="spellEnd"/>
+      <w:r>
+        <w:t xml:space="preserve"> (</w:t>
+      </w:r>
+      <w:proofErr w:type="spellStart"/>
+      <w:r>
+        <w:t>SQLi</w:t>
+      </w:r>
+      <w:proofErr w:type="spellEnd"/>
+      <w:r>
+        <w:t>) y Cross-Site Scripting (XSS).</w:t>
+      </w:r>
+    </w:p>
+    <w:p>
+      <w:pPr>
+        <w:pStyle w:val="Contenido"/>
+        <w:numPr>
+          <w:ilvl w:val="0"/>
+          <w:numId w:val="9"/>
+        </w:numPr>
+        <w:spacing w:line="360" w:lineRule="auto"/>
+        <w:jc w:val="both"/>
+      </w:pPr>
+      <w:r>
+        <w:t xml:space="preserve">Pruebas de Configuración de Servidores: </w:t>
+      </w:r>
+      <w:proofErr w:type="spellStart"/>
+      <w:r>
+        <w:t>Headers</w:t>
+      </w:r>
+      <w:proofErr w:type="spellEnd"/>
+      <w:r>
+        <w:t xml:space="preserve"> HTTP y métodos permitidos.</w:t>
+      </w:r>
+    </w:p>
+    <w:p>
+      <w:pPr>
+        <w:pStyle w:val="Contenido"/>
+        <w:numPr>
+          <w:ilvl w:val="0"/>
+          <w:numId w:val="9"/>
+        </w:numPr>
+        <w:spacing w:line="360" w:lineRule="auto"/>
+        <w:jc w:val="both"/>
+      </w:pPr>
+      <w:r>
+        <w:t xml:space="preserve">Pruebas de Control de Acceso: </w:t>
+      </w:r>
+      <w:proofErr w:type="spellStart"/>
+      <w:r>
+        <w:t>Insecure</w:t>
+      </w:r>
+      <w:proofErr w:type="spellEnd"/>
+      <w:r>
+        <w:t xml:space="preserve"> Direct </w:t>
+      </w:r>
+      <w:proofErr w:type="spellStart"/>
+      <w:r>
+        <w:t>Object</w:t>
+      </w:r>
+      <w:proofErr w:type="spellEnd"/>
+      <w:r>
+        <w:t xml:space="preserve"> </w:t>
+      </w:r>
+      <w:proofErr w:type="spellStart"/>
+      <w:r>
+        <w:t>References</w:t>
+      </w:r>
+      <w:proofErr w:type="spellEnd"/>
+      <w:r>
+        <w:t xml:space="preserve"> (IDOR).</w:t>
+      </w:r>
+    </w:p>
+    <w:p/>
+    <w:p>
+      <w:r>
+        <w:t>REGLAS DE COMPROMISO</w:t>
+      </w:r>
+    </w:p>
+    <w:p/>
+    <w:p>
+      <w:pPr>
+        <w:pStyle w:val="Contenido"/>
+        <w:numPr>
+          <w:ilvl w:val="0"/>
+          <w:numId w:val="7"/>
+        </w:numPr>
+        <w:spacing w:line="360" w:lineRule="auto"/>
+        <w:jc w:val="both"/>
+      </w:pPr>
+      <w:r>
+        <w:t>No se realizarán ataques de Denegación de Servicio (DoS).</w:t>
+      </w:r>
+    </w:p>
+    <w:p>
+      <w:pPr>
+        <w:pStyle w:val="Contenido"/>
+        <w:numPr>
+          <w:ilvl w:val="0"/>
+          <w:numId w:val="7"/>
+        </w:numPr>
+        <w:spacing w:line="360" w:lineRule="auto"/>
+        <w:jc w:val="both"/>
+      </w:pPr>
+      <w:r>
+        <w:t>No se alterarán datos reales en la base de datos de producción.</w:t>
+      </w:r>
+    </w:p>
+    <w:p>
+      <w:pPr>
+        <w:pStyle w:val="Contenido"/>
+        <w:numPr>
+          <w:ilvl w:val="0"/>
+          <w:numId w:val="7"/>
+        </w:numPr>
+        <w:spacing w:line="360" w:lineRule="auto"/>
+        <w:jc w:val="both"/>
+      </w:pPr>
+      <w:r>
+        <w:t>Todas las pruebas se detendrán si se detecta una inestabilidad crítica en el sistema.</w:t>
       </w:r>
     </w:p>
     <w:sectPr>
@@ -2632,6 +1406,118 @@
 <file path=word/numbering.xml><?xml version="1.0" encoding="utf-8"?>
 <w:numbering xmlns:wpc="http://schemas.microsoft.com/office/word/2010/wordprocessingCanvas" xmlns:cx="http://schemas.microsoft.com/office/drawing/2014/chartex" xmlns:cx1="http://schemas.microsoft.com/office/drawing/2015/9/8/chartex" xmlns:cx2="http://schemas.microsoft.com/office/drawing/2015/10/21/chartex" xmlns:cx3="http://schemas.microsoft.com/office/drawing/2016/5/9/chartex" xmlns:cx4="http://schemas.microsoft.com/office/drawing/2016/5/10/chartex" xmlns:cx5="http://schemas.microsoft.com/office/drawing/2016/5/11/chartex" xmlns:cx6="http://schemas.microsoft.com/office/drawing/2016/5/12/chartex" xmlns:cx7="http://schemas.microsoft.com/office/drawing/2016/5/13/chartex" xmlns:cx8="http://schemas.microsoft.com/office/drawing/2016/5/14/chartex" xmlns:mc="http://schemas.openxmlformats.org/markup-compatibility/2006" xmlns:aink="http://schemas.microsoft.com/office/drawing/2016/ink" xmlns:am3d="http://schemas.microsoft.com/office/drawing/2017/model3d" xmlns:o="urn:schemas-microsoft-com:office:office" xmlns:oel="http://schemas.microsoft.com/office/2019/extlst" xmlns:r="http://schemas.openxmlformats.org/officeDocument/2006/relationships" xmlns:m="http://schemas.openxmlformats.org/officeDocument/2006/math" xmlns:v="urn:schemas-microsoft-com:vml" xmlns:wp14="http://schemas.microsoft.com/office/word/2010/wordprocessingDrawing" xmlns:wp="http://schemas.openxmlformats.org/drawingml/2006/wordprocessingDrawing" xmlns:w10="urn:schemas-microsoft-com:office:word" xmlns:w="http://schemas.openxmlformats.org/wordprocessingml/2006/main" xmlns:w14="http://schemas.microsoft.com/office/word/2010/wordml" xmlns:w15="http://schemas.microsoft.com/office/word/2012/wordml" xmlns:w16cex="http://schemas.microsoft.com/office/word/2018/wordml/cex" xmlns:w16cid="http://schemas.microsoft.com/office/word/2016/wordml/cid" xmlns:w16="http://schemas.microsoft.com/office/word/2018/wordml" xmlns:w16du="http://schemas.microsoft.com/office/word/2023/wordml/word16du" xmlns:w16sdtdh="http://schemas.microsoft.com/office/word/2020/wordml/sdtdatahash" xmlns:w16sdtfl="http://schemas.microsoft.com/office/word/2024/wordml/sdtformatlock" xmlns:w16se="http://schemas.microsoft.com/office/word/2015/wordml/symex" xmlns:wpg="http://schemas.microsoft.com/office/word/2010/wordprocessingGroup" xmlns:wpi="http://schemas.microsoft.com/office/word/2010/wordprocessingInk" xmlns:wne="http://schemas.microsoft.com/office/word/2006/wordml" xmlns:wps="http://schemas.microsoft.com/office/word/2010/wordprocessingShape" mc:Ignorable="w14 w15 w16se w16cid w16 w16cex w16sdtdh w16sdtfl w16du wp14">
   <w:abstractNum w:abstractNumId="0" w15:restartNumberingAfterBreak="0">
+    <w:nsid w:val="05A70510"/>
+    <w:multiLevelType w:val="hybridMultilevel"/>
+    <w:tmpl w:val="B46AC684"/>
+    <w:lvl w:ilvl="0" w:tplc="CAB89E5E">
+      <w:numFmt w:val="bullet"/>
+      <w:lvlText w:val="-"/>
+      <w:lvlJc w:val="left"/>
+      <w:pPr>
+        <w:ind w:left="720" w:hanging="360"/>
+      </w:pPr>
+      <w:rPr>
+        <w:rFonts w:ascii="Calibri" w:eastAsiaTheme="minorEastAsia" w:hAnsi="Calibri" w:cs="Calibri" w:hint="default"/>
+      </w:rPr>
+    </w:lvl>
+    <w:lvl w:ilvl="1" w:tplc="080A0003" w:tentative="1">
+      <w:start w:val="1"/>
+      <w:numFmt w:val="bullet"/>
+      <w:lvlText w:val="o"/>
+      <w:lvlJc w:val="left"/>
+      <w:pPr>
+        <w:ind w:left="1440" w:hanging="360"/>
+      </w:pPr>
+      <w:rPr>
+        <w:rFonts w:ascii="Courier New" w:hAnsi="Courier New" w:cs="Courier New" w:hint="default"/>
+      </w:rPr>
+    </w:lvl>
+    <w:lvl w:ilvl="2" w:tplc="080A0005" w:tentative="1">
+      <w:start w:val="1"/>
+      <w:numFmt w:val="bullet"/>
+      <w:lvlText w:val=""/>
+      <w:lvlJc w:val="left"/>
+      <w:pPr>
+        <w:ind w:left="2160" w:hanging="360"/>
+      </w:pPr>
+      <w:rPr>
+        <w:rFonts w:ascii="Wingdings" w:hAnsi="Wingdings" w:hint="default"/>
+      </w:rPr>
+    </w:lvl>
+    <w:lvl w:ilvl="3" w:tplc="080A0001" w:tentative="1">
+      <w:start w:val="1"/>
+      <w:numFmt w:val="bullet"/>
+      <w:lvlText w:val=""/>
+      <w:lvlJc w:val="left"/>
+      <w:pPr>
+        <w:ind w:left="2880" w:hanging="360"/>
+      </w:pPr>
+      <w:rPr>
+        <w:rFonts w:ascii="Symbol" w:hAnsi="Symbol" w:hint="default"/>
+      </w:rPr>
+    </w:lvl>
+    <w:lvl w:ilvl="4" w:tplc="080A0003" w:tentative="1">
+      <w:start w:val="1"/>
+      <w:numFmt w:val="bullet"/>
+      <w:lvlText w:val="o"/>
+      <w:lvlJc w:val="left"/>
+      <w:pPr>
+        <w:ind w:left="3600" w:hanging="360"/>
+      </w:pPr>
+      <w:rPr>
+        <w:rFonts w:ascii="Courier New" w:hAnsi="Courier New" w:cs="Courier New" w:hint="default"/>
+      </w:rPr>
+    </w:lvl>
+    <w:lvl w:ilvl="5" w:tplc="080A0005" w:tentative="1">
+      <w:start w:val="1"/>
+      <w:numFmt w:val="bullet"/>
+      <w:lvlText w:val=""/>
+      <w:lvlJc w:val="left"/>
+      <w:pPr>
+        <w:ind w:left="4320" w:hanging="360"/>
+      </w:pPr>
+      <w:rPr>
+        <w:rFonts w:ascii="Wingdings" w:hAnsi="Wingdings" w:hint="default"/>
+      </w:rPr>
+    </w:lvl>
+    <w:lvl w:ilvl="6" w:tplc="080A0001" w:tentative="1">
+      <w:start w:val="1"/>
+      <w:numFmt w:val="bullet"/>
+      <w:lvlText w:val=""/>
+      <w:lvlJc w:val="left"/>
+      <w:pPr>
+        <w:ind w:left="5040" w:hanging="360"/>
+      </w:pPr>
+      <w:rPr>
+        <w:rFonts w:ascii="Symbol" w:hAnsi="Symbol" w:hint="default"/>
+      </w:rPr>
+    </w:lvl>
+    <w:lvl w:ilvl="7" w:tplc="080A0003" w:tentative="1">
+      <w:start w:val="1"/>
+      <w:numFmt w:val="bullet"/>
+      <w:lvlText w:val="o"/>
+      <w:lvlJc w:val="left"/>
+      <w:pPr>
+        <w:ind w:left="5760" w:hanging="360"/>
+      </w:pPr>
+      <w:rPr>
+        <w:rFonts w:ascii="Courier New" w:hAnsi="Courier New" w:cs="Courier New" w:hint="default"/>
+      </w:rPr>
+    </w:lvl>
+    <w:lvl w:ilvl="8" w:tplc="080A0005" w:tentative="1">
+      <w:start w:val="1"/>
+      <w:numFmt w:val="bullet"/>
+      <w:lvlText w:val=""/>
+      <w:lvlJc w:val="left"/>
+      <w:pPr>
+        <w:ind w:left="6480" w:hanging="360"/>
+      </w:pPr>
+      <w:rPr>
+        <w:rFonts w:ascii="Wingdings" w:hAnsi="Wingdings" w:hint="default"/>
+      </w:rPr>
+    </w:lvl>
+  </w:abstractNum>
+  <w:abstractNum w:abstractNumId="1" w15:restartNumberingAfterBreak="0">
     <w:nsid w:val="12EC1D0E"/>
     <w:multiLevelType w:val="hybridMultilevel"/>
     <w:tmpl w:val="B544852E"/>
@@ -2744,7 +1630,120 @@
       </w:rPr>
     </w:lvl>
   </w:abstractNum>
-  <w:abstractNum w:abstractNumId="1" w15:restartNumberingAfterBreak="0">
+  <w:abstractNum w:abstractNumId="2" w15:restartNumberingAfterBreak="0">
+    <w:nsid w:val="1C7B5720"/>
+    <w:multiLevelType w:val="hybridMultilevel"/>
+    <w:tmpl w:val="5A8620C0"/>
+    <w:lvl w:ilvl="0" w:tplc="080A0001">
+      <w:start w:val="1"/>
+      <w:numFmt w:val="bullet"/>
+      <w:lvlText w:val=""/>
+      <w:lvlJc w:val="left"/>
+      <w:pPr>
+        <w:ind w:left="720" w:hanging="360"/>
+      </w:pPr>
+      <w:rPr>
+        <w:rFonts w:ascii="Symbol" w:hAnsi="Symbol" w:hint="default"/>
+      </w:rPr>
+    </w:lvl>
+    <w:lvl w:ilvl="1" w:tplc="080A0003" w:tentative="1">
+      <w:start w:val="1"/>
+      <w:numFmt w:val="bullet"/>
+      <w:lvlText w:val="o"/>
+      <w:lvlJc w:val="left"/>
+      <w:pPr>
+        <w:ind w:left="1440" w:hanging="360"/>
+      </w:pPr>
+      <w:rPr>
+        <w:rFonts w:ascii="Courier New" w:hAnsi="Courier New" w:cs="Courier New" w:hint="default"/>
+      </w:rPr>
+    </w:lvl>
+    <w:lvl w:ilvl="2" w:tplc="080A0005" w:tentative="1">
+      <w:start w:val="1"/>
+      <w:numFmt w:val="bullet"/>
+      <w:lvlText w:val=""/>
+      <w:lvlJc w:val="left"/>
+      <w:pPr>
+        <w:ind w:left="2160" w:hanging="360"/>
+      </w:pPr>
+      <w:rPr>
+        <w:rFonts w:ascii="Wingdings" w:hAnsi="Wingdings" w:hint="default"/>
+      </w:rPr>
+    </w:lvl>
+    <w:lvl w:ilvl="3" w:tplc="080A0001" w:tentative="1">
+      <w:start w:val="1"/>
+      <w:numFmt w:val="bullet"/>
+      <w:lvlText w:val=""/>
+      <w:lvlJc w:val="left"/>
+      <w:pPr>
+        <w:ind w:left="2880" w:hanging="360"/>
+      </w:pPr>
+      <w:rPr>
+        <w:rFonts w:ascii="Symbol" w:hAnsi="Symbol" w:hint="default"/>
+      </w:rPr>
+    </w:lvl>
+    <w:lvl w:ilvl="4" w:tplc="080A0003" w:tentative="1">
+      <w:start w:val="1"/>
+      <w:numFmt w:val="bullet"/>
+      <w:lvlText w:val="o"/>
+      <w:lvlJc w:val="left"/>
+      <w:pPr>
+        <w:ind w:left="3600" w:hanging="360"/>
+      </w:pPr>
+      <w:rPr>
+        <w:rFonts w:ascii="Courier New" w:hAnsi="Courier New" w:cs="Courier New" w:hint="default"/>
+      </w:rPr>
+    </w:lvl>
+    <w:lvl w:ilvl="5" w:tplc="080A0005" w:tentative="1">
+      <w:start w:val="1"/>
+      <w:numFmt w:val="bullet"/>
+      <w:lvlText w:val=""/>
+      <w:lvlJc w:val="left"/>
+      <w:pPr>
+        <w:ind w:left="4320" w:hanging="360"/>
+      </w:pPr>
+      <w:rPr>
+        <w:rFonts w:ascii="Wingdings" w:hAnsi="Wingdings" w:hint="default"/>
+      </w:rPr>
+    </w:lvl>
+    <w:lvl w:ilvl="6" w:tplc="080A0001" w:tentative="1">
+      <w:start w:val="1"/>
+      <w:numFmt w:val="bullet"/>
+      <w:lvlText w:val=""/>
+      <w:lvlJc w:val="left"/>
+      <w:pPr>
+        <w:ind w:left="5040" w:hanging="360"/>
+      </w:pPr>
+      <w:rPr>
+        <w:rFonts w:ascii="Symbol" w:hAnsi="Symbol" w:hint="default"/>
+      </w:rPr>
+    </w:lvl>
+    <w:lvl w:ilvl="7" w:tplc="080A0003" w:tentative="1">
+      <w:start w:val="1"/>
+      <w:numFmt w:val="bullet"/>
+      <w:lvlText w:val="o"/>
+      <w:lvlJc w:val="left"/>
+      <w:pPr>
+        <w:ind w:left="5760" w:hanging="360"/>
+      </w:pPr>
+      <w:rPr>
+        <w:rFonts w:ascii="Courier New" w:hAnsi="Courier New" w:cs="Courier New" w:hint="default"/>
+      </w:rPr>
+    </w:lvl>
+    <w:lvl w:ilvl="8" w:tplc="080A0005" w:tentative="1">
+      <w:start w:val="1"/>
+      <w:numFmt w:val="bullet"/>
+      <w:lvlText w:val=""/>
+      <w:lvlJc w:val="left"/>
+      <w:pPr>
+        <w:ind w:left="6480" w:hanging="360"/>
+      </w:pPr>
+      <w:rPr>
+        <w:rFonts w:ascii="Wingdings" w:hAnsi="Wingdings" w:hint="default"/>
+      </w:rPr>
+    </w:lvl>
+  </w:abstractNum>
+  <w:abstractNum w:abstractNumId="3" w15:restartNumberingAfterBreak="0">
     <w:nsid w:val="1FAE0EDC"/>
     <w:multiLevelType w:val="hybridMultilevel"/>
     <w:tmpl w:val="879CCB20"/>
@@ -2857,7 +1856,294 @@
       </w:rPr>
     </w:lvl>
   </w:abstractNum>
-  <w:abstractNum w:abstractNumId="2" w15:restartNumberingAfterBreak="0">
+  <w:abstractNum w:abstractNumId="4" w15:restartNumberingAfterBreak="0">
+    <w:nsid w:val="3A1E6282"/>
+    <w:multiLevelType w:val="hybridMultilevel"/>
+    <w:tmpl w:val="FB06C7A0"/>
+    <w:lvl w:ilvl="0" w:tplc="CAB89E5E">
+      <w:numFmt w:val="bullet"/>
+      <w:lvlText w:val="-"/>
+      <w:lvlJc w:val="left"/>
+      <w:pPr>
+        <w:ind w:left="720" w:hanging="360"/>
+      </w:pPr>
+      <w:rPr>
+        <w:rFonts w:ascii="Calibri" w:eastAsiaTheme="minorEastAsia" w:hAnsi="Calibri" w:cs="Calibri" w:hint="default"/>
+      </w:rPr>
+    </w:lvl>
+    <w:lvl w:ilvl="1" w:tplc="080A0003" w:tentative="1">
+      <w:start w:val="1"/>
+      <w:numFmt w:val="bullet"/>
+      <w:lvlText w:val="o"/>
+      <w:lvlJc w:val="left"/>
+      <w:pPr>
+        <w:ind w:left="1440" w:hanging="360"/>
+      </w:pPr>
+      <w:rPr>
+        <w:rFonts w:ascii="Courier New" w:hAnsi="Courier New" w:cs="Courier New" w:hint="default"/>
+      </w:rPr>
+    </w:lvl>
+    <w:lvl w:ilvl="2" w:tplc="080A0005" w:tentative="1">
+      <w:start w:val="1"/>
+      <w:numFmt w:val="bullet"/>
+      <w:lvlText w:val=""/>
+      <w:lvlJc w:val="left"/>
+      <w:pPr>
+        <w:ind w:left="2160" w:hanging="360"/>
+      </w:pPr>
+      <w:rPr>
+        <w:rFonts w:ascii="Wingdings" w:hAnsi="Wingdings" w:hint="default"/>
+      </w:rPr>
+    </w:lvl>
+    <w:lvl w:ilvl="3" w:tplc="080A0001" w:tentative="1">
+      <w:start w:val="1"/>
+      <w:numFmt w:val="bullet"/>
+      <w:lvlText w:val=""/>
+      <w:lvlJc w:val="left"/>
+      <w:pPr>
+        <w:ind w:left="2880" w:hanging="360"/>
+      </w:pPr>
+      <w:rPr>
+        <w:rFonts w:ascii="Symbol" w:hAnsi="Symbol" w:hint="default"/>
+      </w:rPr>
+    </w:lvl>
+    <w:lvl w:ilvl="4" w:tplc="080A0003" w:tentative="1">
+      <w:start w:val="1"/>
+      <w:numFmt w:val="bullet"/>
+      <w:lvlText w:val="o"/>
+      <w:lvlJc w:val="left"/>
+      <w:pPr>
+        <w:ind w:left="3600" w:hanging="360"/>
+      </w:pPr>
+      <w:rPr>
+        <w:rFonts w:ascii="Courier New" w:hAnsi="Courier New" w:cs="Courier New" w:hint="default"/>
+      </w:rPr>
+    </w:lvl>
+    <w:lvl w:ilvl="5" w:tplc="080A0005" w:tentative="1">
+      <w:start w:val="1"/>
+      <w:numFmt w:val="bullet"/>
+      <w:lvlText w:val=""/>
+      <w:lvlJc w:val="left"/>
+      <w:pPr>
+        <w:ind w:left="4320" w:hanging="360"/>
+      </w:pPr>
+      <w:rPr>
+        <w:rFonts w:ascii="Wingdings" w:hAnsi="Wingdings" w:hint="default"/>
+      </w:rPr>
+    </w:lvl>
+    <w:lvl w:ilvl="6" w:tplc="080A0001" w:tentative="1">
+      <w:start w:val="1"/>
+      <w:numFmt w:val="bullet"/>
+      <w:lvlText w:val=""/>
+      <w:lvlJc w:val="left"/>
+      <w:pPr>
+        <w:ind w:left="5040" w:hanging="360"/>
+      </w:pPr>
+      <w:rPr>
+        <w:rFonts w:ascii="Symbol" w:hAnsi="Symbol" w:hint="default"/>
+      </w:rPr>
+    </w:lvl>
+    <w:lvl w:ilvl="7" w:tplc="080A0003" w:tentative="1">
+      <w:start w:val="1"/>
+      <w:numFmt w:val="bullet"/>
+      <w:lvlText w:val="o"/>
+      <w:lvlJc w:val="left"/>
+      <w:pPr>
+        <w:ind w:left="5760" w:hanging="360"/>
+      </w:pPr>
+      <w:rPr>
+        <w:rFonts w:ascii="Courier New" w:hAnsi="Courier New" w:cs="Courier New" w:hint="default"/>
+      </w:rPr>
+    </w:lvl>
+    <w:lvl w:ilvl="8" w:tplc="080A0005" w:tentative="1">
+      <w:start w:val="1"/>
+      <w:numFmt w:val="bullet"/>
+      <w:lvlText w:val=""/>
+      <w:lvlJc w:val="left"/>
+      <w:pPr>
+        <w:ind w:left="6480" w:hanging="360"/>
+      </w:pPr>
+      <w:rPr>
+        <w:rFonts w:ascii="Wingdings" w:hAnsi="Wingdings" w:hint="default"/>
+      </w:rPr>
+    </w:lvl>
+  </w:abstractNum>
+  <w:abstractNum w:abstractNumId="5" w15:restartNumberingAfterBreak="0">
+    <w:nsid w:val="45AA4E19"/>
+    <w:multiLevelType w:val="hybridMultilevel"/>
+    <w:tmpl w:val="D85E4A24"/>
+    <w:lvl w:ilvl="0" w:tplc="080A000F">
+      <w:start w:val="1"/>
+      <w:numFmt w:val="decimal"/>
+      <w:lvlText w:val="%1."/>
+      <w:lvlJc w:val="left"/>
+      <w:pPr>
+        <w:ind w:left="720" w:hanging="360"/>
+      </w:pPr>
+    </w:lvl>
+    <w:lvl w:ilvl="1" w:tplc="080A0019" w:tentative="1">
+      <w:start w:val="1"/>
+      <w:numFmt w:val="lowerLetter"/>
+      <w:lvlText w:val="%2."/>
+      <w:lvlJc w:val="left"/>
+      <w:pPr>
+        <w:ind w:left="1440" w:hanging="360"/>
+      </w:pPr>
+    </w:lvl>
+    <w:lvl w:ilvl="2" w:tplc="080A001B" w:tentative="1">
+      <w:start w:val="1"/>
+      <w:numFmt w:val="lowerRoman"/>
+      <w:lvlText w:val="%3."/>
+      <w:lvlJc w:val="right"/>
+      <w:pPr>
+        <w:ind w:left="2160" w:hanging="180"/>
+      </w:pPr>
+    </w:lvl>
+    <w:lvl w:ilvl="3" w:tplc="080A000F" w:tentative="1">
+      <w:start w:val="1"/>
+      <w:numFmt w:val="decimal"/>
+      <w:lvlText w:val="%4."/>
+      <w:lvlJc w:val="left"/>
+      <w:pPr>
+        <w:ind w:left="2880" w:hanging="360"/>
+      </w:pPr>
+    </w:lvl>
+    <w:lvl w:ilvl="4" w:tplc="080A0019" w:tentative="1">
+      <w:start w:val="1"/>
+      <w:numFmt w:val="lowerLetter"/>
+      <w:lvlText w:val="%5."/>
+      <w:lvlJc w:val="left"/>
+      <w:pPr>
+        <w:ind w:left="3600" w:hanging="360"/>
+      </w:pPr>
+    </w:lvl>
+    <w:lvl w:ilvl="5" w:tplc="080A001B" w:tentative="1">
+      <w:start w:val="1"/>
+      <w:numFmt w:val="lowerRoman"/>
+      <w:lvlText w:val="%6."/>
+      <w:lvlJc w:val="right"/>
+      <w:pPr>
+        <w:ind w:left="4320" w:hanging="180"/>
+      </w:pPr>
+    </w:lvl>
+    <w:lvl w:ilvl="6" w:tplc="080A000F" w:tentative="1">
+      <w:start w:val="1"/>
+      <w:numFmt w:val="decimal"/>
+      <w:lvlText w:val="%7."/>
+      <w:lvlJc w:val="left"/>
+      <w:pPr>
+        <w:ind w:left="5040" w:hanging="360"/>
+      </w:pPr>
+    </w:lvl>
+    <w:lvl w:ilvl="7" w:tplc="080A0019" w:tentative="1">
+      <w:start w:val="1"/>
+      <w:numFmt w:val="lowerLetter"/>
+      <w:lvlText w:val="%8."/>
+      <w:lvlJc w:val="left"/>
+      <w:pPr>
+        <w:ind w:left="5760" w:hanging="360"/>
+      </w:pPr>
+    </w:lvl>
+    <w:lvl w:ilvl="8" w:tplc="080A001B" w:tentative="1">
+      <w:start w:val="1"/>
+      <w:numFmt w:val="lowerRoman"/>
+      <w:lvlText w:val="%9."/>
+      <w:lvlJc w:val="right"/>
+      <w:pPr>
+        <w:ind w:left="6480" w:hanging="180"/>
+      </w:pPr>
+    </w:lvl>
+  </w:abstractNum>
+  <w:abstractNum w:abstractNumId="6" w15:restartNumberingAfterBreak="0">
+    <w:nsid w:val="4BED193F"/>
+    <w:multiLevelType w:val="hybridMultilevel"/>
+    <w:tmpl w:val="0FEC20E4"/>
+    <w:lvl w:ilvl="0" w:tplc="080A000F">
+      <w:start w:val="1"/>
+      <w:numFmt w:val="decimal"/>
+      <w:lvlText w:val="%1."/>
+      <w:lvlJc w:val="left"/>
+      <w:pPr>
+        <w:ind w:left="720" w:hanging="360"/>
+      </w:pPr>
+      <w:rPr>
+        <w:rFonts w:hint="default"/>
+      </w:rPr>
+    </w:lvl>
+    <w:lvl w:ilvl="1" w:tplc="080A0019" w:tentative="1">
+      <w:start w:val="1"/>
+      <w:numFmt w:val="lowerLetter"/>
+      <w:lvlText w:val="%2."/>
+      <w:lvlJc w:val="left"/>
+      <w:pPr>
+        <w:ind w:left="1440" w:hanging="360"/>
+      </w:pPr>
+    </w:lvl>
+    <w:lvl w:ilvl="2" w:tplc="080A001B" w:tentative="1">
+      <w:start w:val="1"/>
+      <w:numFmt w:val="lowerRoman"/>
+      <w:lvlText w:val="%3."/>
+      <w:lvlJc w:val="right"/>
+      <w:pPr>
+        <w:ind w:left="2160" w:hanging="180"/>
+      </w:pPr>
+    </w:lvl>
+    <w:lvl w:ilvl="3" w:tplc="080A000F" w:tentative="1">
+      <w:start w:val="1"/>
+      <w:numFmt w:val="decimal"/>
+      <w:lvlText w:val="%4."/>
+      <w:lvlJc w:val="left"/>
+      <w:pPr>
+        <w:ind w:left="2880" w:hanging="360"/>
+      </w:pPr>
+    </w:lvl>
+    <w:lvl w:ilvl="4" w:tplc="080A0019" w:tentative="1">
+      <w:start w:val="1"/>
+      <w:numFmt w:val="lowerLetter"/>
+      <w:lvlText w:val="%5."/>
+      <w:lvlJc w:val="left"/>
+      <w:pPr>
+        <w:ind w:left="3600" w:hanging="360"/>
+      </w:pPr>
+    </w:lvl>
+    <w:lvl w:ilvl="5" w:tplc="080A001B" w:tentative="1">
+      <w:start w:val="1"/>
+      <w:numFmt w:val="lowerRoman"/>
+      <w:lvlText w:val="%6."/>
+      <w:lvlJc w:val="right"/>
+      <w:pPr>
+        <w:ind w:left="4320" w:hanging="180"/>
+      </w:pPr>
+    </w:lvl>
+    <w:lvl w:ilvl="6" w:tplc="080A000F" w:tentative="1">
+      <w:start w:val="1"/>
+      <w:numFmt w:val="decimal"/>
+      <w:lvlText w:val="%7."/>
+      <w:lvlJc w:val="left"/>
+      <w:pPr>
+        <w:ind w:left="5040" w:hanging="360"/>
+      </w:pPr>
+    </w:lvl>
+    <w:lvl w:ilvl="7" w:tplc="080A0019" w:tentative="1">
+      <w:start w:val="1"/>
+      <w:numFmt w:val="lowerLetter"/>
+      <w:lvlText w:val="%8."/>
+      <w:lvlJc w:val="left"/>
+      <w:pPr>
+        <w:ind w:left="5760" w:hanging="360"/>
+      </w:pPr>
+    </w:lvl>
+    <w:lvl w:ilvl="8" w:tplc="080A001B" w:tentative="1">
+      <w:start w:val="1"/>
+      <w:numFmt w:val="lowerRoman"/>
+      <w:lvlText w:val="%9."/>
+      <w:lvlJc w:val="right"/>
+      <w:pPr>
+        <w:ind w:left="6480" w:hanging="180"/>
+      </w:pPr>
+    </w:lvl>
+  </w:abstractNum>
+  <w:abstractNum w:abstractNumId="7" w15:restartNumberingAfterBreak="0">
     <w:nsid w:val="5E3557F4"/>
     <w:multiLevelType w:val="hybridMultilevel"/>
     <w:tmpl w:val="C4CECD20"/>
@@ -2970,7 +2256,7 @@
       </w:rPr>
     </w:lvl>
   </w:abstractNum>
-  <w:abstractNum w:abstractNumId="3" w15:restartNumberingAfterBreak="0">
+  <w:abstractNum w:abstractNumId="8" w15:restartNumberingAfterBreak="0">
     <w:nsid w:val="75865EA5"/>
     <w:multiLevelType w:val="hybridMultilevel"/>
     <w:tmpl w:val="C2385AE6"/>
@@ -3083,7 +2369,7 @@
       </w:rPr>
     </w:lvl>
   </w:abstractNum>
-  <w:abstractNum w:abstractNumId="4" w15:restartNumberingAfterBreak="0">
+  <w:abstractNum w:abstractNumId="9" w15:restartNumberingAfterBreak="0">
     <w:nsid w:val="7FB350BD"/>
     <w:multiLevelType w:val="hybridMultilevel"/>
     <w:tmpl w:val="49B88BC8"/>
@@ -3197,18 +2483,33 @@
     </w:lvl>
   </w:abstractNum>
   <w:num w:numId="1" w16cid:durableId="901525743">
+    <w:abstractNumId w:val="9"/>
+  </w:num>
+  <w:num w:numId="2" w16cid:durableId="310257497">
+    <w:abstractNumId w:val="8"/>
+  </w:num>
+  <w:num w:numId="3" w16cid:durableId="1378385256">
+    <w:abstractNumId w:val="7"/>
+  </w:num>
+  <w:num w:numId="4" w16cid:durableId="380137379">
+    <w:abstractNumId w:val="3"/>
+  </w:num>
+  <w:num w:numId="5" w16cid:durableId="468060313">
+    <w:abstractNumId w:val="1"/>
+  </w:num>
+  <w:num w:numId="6" w16cid:durableId="804198198">
+    <w:abstractNumId w:val="2"/>
+  </w:num>
+  <w:num w:numId="7" w16cid:durableId="1392342109">
     <w:abstractNumId w:val="4"/>
   </w:num>
-  <w:num w:numId="2" w16cid:durableId="310257497">
-    <w:abstractNumId w:val="3"/>
+  <w:num w:numId="8" w16cid:durableId="207189445">
+    <w:abstractNumId w:val="5"/>
   </w:num>
-  <w:num w:numId="3" w16cid:durableId="1378385256">
-    <w:abstractNumId w:val="2"/>
+  <w:num w:numId="9" w16cid:durableId="196818864">
+    <w:abstractNumId w:val="6"/>
   </w:num>
-  <w:num w:numId="4" w16cid:durableId="380137379">
-    <w:abstractNumId w:val="1"/>
-  </w:num>
-  <w:num w:numId="5" w16cid:durableId="468060313">
+  <w:num w:numId="10" w16cid:durableId="909997293">
     <w:abstractNumId w:val="0"/>
   </w:num>
 </w:numbering>
@@ -4091,13 +3392,6 @@
     <w:pitch w:val="variable"/>
     <w:sig w:usb0="E1002EFF" w:usb1="C000605B" w:usb2="00000029" w:usb3="00000000" w:csb0="000101FF" w:csb1="00000000"/>
   </w:font>
-  <w:font w:name="Consolas">
-    <w:panose1 w:val="020B0609020204030204"/>
-    <w:charset w:val="00"/>
-    <w:family w:val="modern"/>
-    <w:pitch w:val="fixed"/>
-    <w:sig w:usb0="E00006FF" w:usb1="0000FCFF" w:usb2="00000001" w:usb3="00000000" w:csb0="0000019F" w:csb1="00000000"/>
-  </w:font>
   <w:font w:name="Aptos">
     <w:charset w:val="00"/>
     <w:family w:val="swiss"/>
@@ -4133,6 +3427,8 @@
     <w:rsid w:val="00226ABC"/>
     <w:rsid w:val="003C0C03"/>
     <w:rsid w:val="0050761C"/>
+    <w:rsid w:val="00562F6E"/>
+    <w:rsid w:val="00813A00"/>
     <w:rsid w:val="009A47D8"/>
     <w:rsid w:val="00B95C1F"/>
     <w:rsid w:val="00C80099"/>
@@ -4630,21 +3926,6 @@
   <w:style w:type="paragraph" w:customStyle="1" w:styleId="8AC8F99481534EEC98D5798E47E31FC2">
     <w:name w:val="8AC8F99481534EEC98D5798E47E31FC2"/>
   </w:style>
-  <w:style w:type="paragraph" w:customStyle="1" w:styleId="B4A70EBBBF6D404C8B60B6FABDD0D462">
-    <w:name w:val="B4A70EBBBF6D404C8B60B6FABDD0D462"/>
-  </w:style>
-  <w:style w:type="paragraph" w:customStyle="1" w:styleId="12B0D77CF56941118D501557E5DD35EC">
-    <w:name w:val="12B0D77CF56941118D501557E5DD35EC"/>
-  </w:style>
-  <w:style w:type="paragraph" w:customStyle="1" w:styleId="1DDDECE6201F44668E81E7F30EABE932">
-    <w:name w:val="1DDDECE6201F44668E81E7F30EABE932"/>
-  </w:style>
-  <w:style w:type="paragraph" w:customStyle="1" w:styleId="3A383558934644F6946DD488E578BF93">
-    <w:name w:val="3A383558934644F6946DD488E578BF93"/>
-  </w:style>
-  <w:style w:type="paragraph" w:customStyle="1" w:styleId="F95FE7E2A09745A0B83BF06C65A2C538">
-    <w:name w:val="F95FE7E2A09745A0B83BF06C65A2C538"/>
-  </w:style>
 </w:styles>
 </file>
 

</xml_diff>